<commit_message>
Fix content plan tables/faq coverage and stabilize draft validation-repair flow
</commit_message>
<xml_diff>
--- a/data/artifacts/andheri-west-resale_locality-draft.docx
+++ b/data/artifacts/andheri-west-resale_locality-draft.docx
@@ -7,12 +7,12 @@
         <w:pStyle w:val="Heading1"/>
       </w:pPr>
       <w:r>
-        <w:t>flats for sale in andheri west mumbai</w:t>
+        <w:t>—</w:t>
       </w:r>
     </w:p>
     <w:p>
       <w:r>
-        <w:t>Discover a range of flats for sale in Andheri West Mumbai, including 1 BHK, 2 BHK, and 3 BHK options. View current asking prices and resale flats in Mumbai's Andheri West area on Square Yards.</w:t>
+        <w:t>—</w:t>
       </w:r>
     </w:p>
     <w:p>
@@ -25,3284 +25,12 @@
     </w:p>
     <w:p>
       <w:r>
-        <w:t>Title: flats for sale in andheri west mumbai | Square Yards</w:t>
+        <w:t>Title: —</w:t>
       </w:r>
     </w:p>
     <w:p>
       <w:r>
-        <w:t>Meta Description: Explore flats for sale in Andheri West Mumbai with details on asking price, available 1, 2, and 3 BHK options, and resale listings on Square Yards.</w:t>
-      </w:r>
-    </w:p>
-    <w:p>
-      <w:pPr>
-        <w:pStyle w:val="Heading2"/>
-      </w:pPr>
-      <w:r>
-        <w:t>Editorial Sections</w:t>
-      </w:r>
-    </w:p>
-    <w:p>
-      <w:pPr>
-        <w:pStyle w:val="Heading3"/>
-      </w:pPr>
-      <w:r>
-        <w:t>Resale Property Overview in Andheri West, Mumbai</w:t>
-      </w:r>
-    </w:p>
-    <w:p>
-      <w:r>
-        <w:t>Andheri West, located in Mumbai's Western Suburbs, offers a wide range of resale properties across numerous residential projects. The locality features a diverse selection of flats catering to various preferences and configurations, making it a popular choice for buyers in the resale market. The average asking price for flats here is ₹40,238 per square foot, reflecting the current pricing trends in this area.</w:t>
-      </w:r>
-    </w:p>
-    <w:p>
-      <w:pPr>
-        <w:pStyle w:val="Heading3"/>
-      </w:pPr>
-      <w:r>
-        <w:t>Resale Market Snapshot</w:t>
-      </w:r>
-    </w:p>
-    <w:p>
-      <w:r>
-        <w:t>Andheri West's resale market offers a diverse selection of properties, with over 2,000 listings spread across more than 1,760 projects. Apartments dominate the market, reflecting the area's residential character, while other property types also contribute to the variety available. The average asking price per square foot for resale apartments stands at approximately ₹40,238, highlighting the locality's position within Mumbai's Western Suburbs. Buyer interest remains steady, supported by active market engagement through visits and enquiries. The market features a range of apartment configurations, including 1 BHK, 2 BHK, and 3 BHK units, catering to varied preferences and needs among prospective buyers in Andheri West.</w:t>
-      </w:r>
-    </w:p>
-    <w:p>
-      <w:pPr>
-        <w:pStyle w:val="Heading3"/>
-      </w:pPr>
-      <w:r>
-        <w:t>Price Trends and Rates</w:t>
-      </w:r>
-    </w:p>
-    <w:p>
-      <w:r>
-        <w:t>Resale price signals for Andheri West, Mumbai currently centre around an asking price of ₹40,238. This gives a grounded starting point for understanding how the visible resale inventory on this page is positioned. Within the available trend inputs, the latest tracked period is Dec 2025, the locality-level rate is ₹40,238, the micromarket-level rate is ₹21,180. These values help place the current page-level asking signal in a wider local market context without introducing unsupported interpretation.</w:t>
-      </w:r>
-    </w:p>
-    <w:p>
-      <w:pPr>
-        <w:pStyle w:val="Heading3"/>
-      </w:pPr>
-      <w:r>
-        <w:t>BHK and Inventory Mix</w:t>
-      </w:r>
-    </w:p>
-    <w:p>
-      <w:r>
-        <w:t>The resale market in Andheri West features a variety of BHK configurations. Listings include 789 units of 3 BHK flats, 579 units of 2 BHK flats, and 188 units of 4 BHK flats. Smaller options such as 1 BHK and 1 RK units are also available, with 141 and 15 listings respectively. Apartments form the largest segment of the property types, totaling 1,658 listings across multiple BHK sizes. Alongside apartments, the inventory includes builder floors, office spaces, shops, showrooms, penthouses, villas, and independent houses, offering a broad selection for prospective buyers exploring flats for sale in Andheri West, Mumbai.</w:t>
-      </w:r>
-    </w:p>
-    <w:p>
-      <w:pPr>
-        <w:pStyle w:val="Heading3"/>
-      </w:pPr>
-      <w:r>
-        <w:t>Nearby Localities Buyers Can Also Explore</w:t>
-      </w:r>
-    </w:p>
-    <w:p>
-      <w:r>
-        <w:t>Buyers interested in Andheri West can also explore several nearby localities within a kilometer, such as Mudran Press Colony, Suresh Nagar, and Bhudargarh Colony. These areas provide a variety of resale listings, with prices per square foot reflecting the diverse options available in the vicinity. For instance, SV Patel Nagar offers a substantial number of resale properties, while Shashtri Nagar also has a notable supply. Additionally, rental properties are accessible in these neighboring localities, giving prospective buyers more flexibility when considering flats for sale around Andheri West in Mumbai.</w:t>
-      </w:r>
-    </w:p>
-    <w:p>
-      <w:pPr>
-        <w:pStyle w:val="Heading3"/>
-      </w:pPr>
-      <w:r>
-        <w:t>Status and Readiness Snapshot</w:t>
-      </w:r>
-    </w:p>
-    <w:p>
-      <w:r>
-        <w:t>The resale market in Andheri West offers a variety of properties at different stages of development, catering to diverse buyer preferences. The largest segment is Ready To Move units, with 957 listings averaging an asking price of ₹31,639 per square foot. Well Occupied properties follow, with 433 units priced similarly. Under Construction projects are fewer, totaling 77 listings, with an average asking price slightly higher at ₹34,903 per square foot. Smaller segments include Advanced Stage, Partially Ready To Move, Mid Stage, and New Launch properties, providing options for buyers with varying timelines for possession.</w:t>
-      </w:r>
-    </w:p>
-    <w:p>
-      <w:pPr>
-        <w:pStyle w:val="Heading3"/>
-      </w:pPr>
-      <w:r>
-        <w:t>Review and Rating Signals</w:t>
-      </w:r>
-    </w:p>
-    <w:p>
-      <w:r>
-        <w:t>Andheri West has received a total of 97 reviews, with an average rating of approximately 4.24 out of 5. The distribution of ratings shows that 40 reviews are 5-star and 43 are 4-star, while lower ratings are less frequent. The AI-generated summary describes Andheri West as a lively and well-connected locality known for its entertainment options and proximity to media hubs. However, challenges such as traffic congestion, waterlogging during monsoons, and higher living costs are noted. The area is recognized for its vibrant urban lifestyle, with access to hospitals, educational institutions, and shopping centers.</w:t>
-      </w:r>
-    </w:p>
-    <w:p>
-      <w:pPr>
-        <w:pStyle w:val="Heading3"/>
-      </w:pPr>
-      <w:r>
-        <w:t>Market Strengths, Challenges, and Opportunities</w:t>
-      </w:r>
-    </w:p>
-    <w:p>
-      <w:r>
-        <w:t>The structured market snapshot for Andheri West, Mumbai suggests the visible resale market should be read through a measured lens rather than a promotional one. The Andheri West real estate market in Mumbai is currently dynamic, with asking prices averaging ₹40,238 per sq ft. Recent quarterly trends reveal a notable appreciation, particularly from June to December 2025, signaling strong market confidence. The area has seen substantial transaction activity, with 2,920 registered deals totaling a gross value of ₹7,241 Cr over the past year. This vibrant market caters to diverse preferences, offering a mix of apartments, villas, and commercial spaces, with significant demand for Ready To Move properties, and is actively shaped by leading developers like Chandiwala Enterprises and Platinum Corp. This is the broad framing available in the source-backed property-rates summary, and it works best as context for understanding how the locality is currently being described within the attached data. On the positive side, the same summary surfaces strengths such as Andheri West maintains a strong overall market sentiment with an average asking price of ₹40,238 per sq ft and positive quarterly price trends., The significant volume of 2,920 registered transactions and a gross value of ₹7,241 Cr highlights a and active real estate market., The dominance of Ready To Move properties (957 units) caters to immediate occupancy needs, driving consistent buyer interest., The presence of established and active developers like Chandiwala Enterprises and Platinum Corp ensures continued development and market stability.. Taken together, these points indicate where the locality appears comparatively stable, active, or attractive within the current market narrative. They should still be read as descriptive source signals, not as blanket endorsements. The summary also leaves room for caution by highlighting challenges such as The commercial shop segment in Andheri West has experienced a 6.11% price decline, despite commanding the highest per sq ft rate, suggesting potential oversupply or shifting demand., Advanced Stage projects have seen a significant 12.06% price decrease, indicating possible challenges in offloading properties close to completion or pricing adjustments., The absence of average rental rate data makes it difficult for potential investors to accurately assess rental yield and passive income opportunities., Some top projects by transaction, like Rustomjee Elita, have seen price declines, which could indicate localized market corrections or specific project-related issues.. That matters because it prevents the section from sounding one-sided and gives buyers or investors a more balanced reading of the locality. These challenges are not predictions, but they do flag the friction points currently visible in the structured input. Where the source identifies opportunity areas, it points to themes such as Investing in apartments in Andheri West, which show a healthy 4.61% price increase and an average rate of ₹40,238 per sq ft, presents a stable growth opportunity., Considering localities like Vile Parle West, which recorded a substantial 7.75% price appreciation, for higher capital gains., Exploring Under Construction projects, currently averaging ₹34,903 per sq ft with a slight positive trend, at competitive prices before completion., High-value projects such as K Raheja Raheja Classique, with significant transaction values and a strong per sq ft rate, indicate for properties.. In practical terms, these cues can help a reader understand where the locality may deserve closer attention, especially when comparing multiple nearby markets or project clusters. Even here, the wording should be treated as grounded market context rather than guaranteed upside.</w:t>
-      </w:r>
-    </w:p>
-    <w:p>
-      <w:pPr>
-        <w:pStyle w:val="Heading3"/>
-      </w:pPr>
-      <w:r>
-        <w:t>Demand and Supply Signals</w:t>
-      </w:r>
-    </w:p>
-    <w:p>
-      <w:r>
-        <w:t>Current sale-side inventory inputs show sale available count is 2039. This gives a direct view of the scale of resale supply currently represented on the page. At the unit-type level, the available grounded inputs indicate for 1 BHK, listing count is 142, demand percent is 18, supply percent is 8. This helps explain how the visible resale inventory is distributed for one of the surfaced configurations. Listing-range inputs further show listing range document count is 1933, minimum listed price is ₹2,320,000, maximum listed price is ₹4,900,000,000. These values help frame the spread of resale listings represented in the current structured dataset.</w:t>
-      </w:r>
-    </w:p>
-    <w:p>
-      <w:pPr>
-        <w:pStyle w:val="Heading3"/>
-      </w:pPr>
-      <w:r>
-        <w:t>Property Type Signals</w:t>
-      </w:r>
-    </w:p>
-    <w:p>
-      <w:r>
-        <w:t>The available property-type inputs show property type is shop, average listed value in this input is ₹78,643, change percent is -6.11. This gives a grounded snapshot of one visible property-type bucket in the current resale dataset. Within the structured property-type distribution, Apartment appears in the sale property-type mix, document count is 1658. The visible status-level inputs also indicate status bucket is Ready To Move, units are 957, average price is ₹31,639. This is useful where the page includes readiness-linked property segmentation.</w:t>
-      </w:r>
-    </w:p>
-    <w:p>
-      <w:pPr>
-        <w:pStyle w:val="Heading3"/>
-      </w:pPr>
-      <w:r>
-        <w:t>Property Type Rate Snapshot</w:t>
-      </w:r>
-    </w:p>
-    <w:p>
-      <w:r>
-        <w:t>The visible property-type rate snapshot shows property type is shop, average listed value in this input is ₹78,643, change percent is -6.11. This helps explain how one property-type bucket is represented in the current resale pricing layer. At the local rate level, the grounded input shows location name is Veera Desai Road, average rate is ₹33,765, change percentage is 0.</w:t>
-      </w:r>
-    </w:p>
-    <w:p>
-      <w:pPr>
-        <w:pStyle w:val="Heading3"/>
-      </w:pPr>
-      <w:r>
-        <w:t>What Buyers Can Explore Here</w:t>
-      </w:r>
-    </w:p>
-    <w:p>
-      <w:r>
-        <w:t>Buyers exploring flats for sale in Andheri West Mumbai will find a wide selection of properties across different BHK configurations, with 3 BHK and 2 BHK flats being the most common. The average asking price is around ₹40,238 per square foot, with options spanning from smaller 1 BHK units to larger 5 and 6 BHK homes. The locality offers a mix of apartments, builder floors, and other property types, catering to varied preferences. For those interested in specific property types or sizes, dedicated listings for 1 BHK, 2 BHK, 3 BHK, and larger flats are accessible, along with links to new projects, ready-to-move, and under-construction developments. This range provides buyers with multiple avenues to consider within Andheri West's resale market.</w:t>
-      </w:r>
-    </w:p>
-    <w:p>
-      <w:pPr>
-        <w:pStyle w:val="Heading2"/>
-      </w:pPr>
-      <w:r>
-        <w:t>Key Data Tables</w:t>
-      </w:r>
-    </w:p>
-    <w:p>
-      <w:pPr>
-        <w:pStyle w:val="Heading3"/>
-      </w:pPr>
-      <w:r>
-        <w:t>Price Trend Snapshot</w:t>
-      </w:r>
-    </w:p>
-    <w:p>
-      <w:r>
-        <w:t>The Price Trend Snapshot for Andheri West in Mumbai highlights the quarterly asking rates for resale properties from March to December 2025. In December 2025, the asking price stands at ₹40,238 per square foot, significantly higher than the Mumbai Western Suburbs micromarket rate of ₹21,180. This table provides a clear comparison of locality-specific pricing against the broader micromarket, showing a steady increase in Andheri West's rates over the observed quarters.</w:t>
-      </w:r>
-    </w:p>
-    <w:tbl>
-      <w:tblPr>
-        <w:tblStyle w:val="TableGrid"/>
-        <w:tblW w:type="auto" w:w="0"/>
-        <w:tblLook w:firstColumn="1" w:firstRow="1" w:lastColumn="0" w:lastRow="0" w:noHBand="0" w:noVBand="1" w:val="04A0"/>
-      </w:tblPr>
-      <w:tblGrid>
-        <w:gridCol w:w="2160"/>
-        <w:gridCol w:w="2160"/>
-        <w:gridCol w:w="2160"/>
-        <w:gridCol w:w="2160"/>
-      </w:tblGrid>
-      <w:tr>
-        <w:tc>
-          <w:tcPr>
-            <w:tcW w:type="dxa" w:w="2160"/>
-          </w:tcPr>
-          <w:p>
-            <w:r>
-              <w:t>quarterName</w:t>
-            </w:r>
-          </w:p>
-        </w:tc>
-        <w:tc>
-          <w:tcPr>
-            <w:tcW w:type="dxa" w:w="2160"/>
-          </w:tcPr>
-          <w:p>
-            <w:r>
-              <w:t>locationRate</w:t>
-            </w:r>
-          </w:p>
-        </w:tc>
-        <w:tc>
-          <w:tcPr>
-            <w:tcW w:type="dxa" w:w="2160"/>
-          </w:tcPr>
-          <w:p>
-            <w:r>
-              <w:t>micromarketRate</w:t>
-            </w:r>
-          </w:p>
-        </w:tc>
-        <w:tc>
-          <w:tcPr>
-            <w:tcW w:type="dxa" w:w="2160"/>
-          </w:tcPr>
-          <w:p>
-            <w:r>
-              <w:t>cityRate</w:t>
-            </w:r>
-          </w:p>
-        </w:tc>
-      </w:tr>
-      <w:tr>
-        <w:tc>
-          <w:tcPr>
-            <w:tcW w:type="dxa" w:w="2160"/>
-          </w:tcPr>
-          <w:p>
-            <w:r>
-              <w:t>Dec 2025</w:t>
-            </w:r>
-          </w:p>
-        </w:tc>
-        <w:tc>
-          <w:tcPr>
-            <w:tcW w:type="dxa" w:w="2160"/>
-          </w:tcPr>
-          <w:p>
-            <w:r>
-              <w:t>₹40,238</w:t>
-            </w:r>
-          </w:p>
-        </w:tc>
-        <w:tc>
-          <w:tcPr>
-            <w:tcW w:type="dxa" w:w="2160"/>
-          </w:tcPr>
-          <w:p>
-            <w:r>
-              <w:t>₹21,180</w:t>
-            </w:r>
-          </w:p>
-        </w:tc>
-        <w:tc>
-          <w:tcPr>
-            <w:tcW w:type="dxa" w:w="2160"/>
-          </w:tcPr>
-          <w:p>
-            <w:r>
-              <w:t>—</w:t>
-            </w:r>
-          </w:p>
-        </w:tc>
-      </w:tr>
-      <w:tr>
-        <w:tc>
-          <w:tcPr>
-            <w:tcW w:type="dxa" w:w="2160"/>
-          </w:tcPr>
-          <w:p>
-            <w:r>
-              <w:t>Sep 2025</w:t>
-            </w:r>
-          </w:p>
-        </w:tc>
-        <w:tc>
-          <w:tcPr>
-            <w:tcW w:type="dxa" w:w="2160"/>
-          </w:tcPr>
-          <w:p>
-            <w:r>
-              <w:t>₹38,465</w:t>
-            </w:r>
-          </w:p>
-        </w:tc>
-        <w:tc>
-          <w:tcPr>
-            <w:tcW w:type="dxa" w:w="2160"/>
-          </w:tcPr>
-          <w:p>
-            <w:r>
-              <w:t>₹21,139</w:t>
-            </w:r>
-          </w:p>
-        </w:tc>
-        <w:tc>
-          <w:tcPr>
-            <w:tcW w:type="dxa" w:w="2160"/>
-          </w:tcPr>
-          <w:p>
-            <w:r>
-              <w:t>—</w:t>
-            </w:r>
-          </w:p>
-        </w:tc>
-      </w:tr>
-      <w:tr>
-        <w:tc>
-          <w:tcPr>
-            <w:tcW w:type="dxa" w:w="2160"/>
-          </w:tcPr>
-          <w:p>
-            <w:r>
-              <w:t>Jun 2025</w:t>
-            </w:r>
-          </w:p>
-        </w:tc>
-        <w:tc>
-          <w:tcPr>
-            <w:tcW w:type="dxa" w:w="2160"/>
-          </w:tcPr>
-          <w:p>
-            <w:r>
-              <w:t>₹36,900</w:t>
-            </w:r>
-          </w:p>
-        </w:tc>
-        <w:tc>
-          <w:tcPr>
-            <w:tcW w:type="dxa" w:w="2160"/>
-          </w:tcPr>
-          <w:p>
-            <w:r>
-              <w:t>₹21,028</w:t>
-            </w:r>
-          </w:p>
-        </w:tc>
-        <w:tc>
-          <w:tcPr>
-            <w:tcW w:type="dxa" w:w="2160"/>
-          </w:tcPr>
-          <w:p>
-            <w:r>
-              <w:t>—</w:t>
-            </w:r>
-          </w:p>
-        </w:tc>
-      </w:tr>
-      <w:tr>
-        <w:tc>
-          <w:tcPr>
-            <w:tcW w:type="dxa" w:w="2160"/>
-          </w:tcPr>
-          <w:p>
-            <w:r>
-              <w:t>Mar 2025</w:t>
-            </w:r>
-          </w:p>
-        </w:tc>
-        <w:tc>
-          <w:tcPr>
-            <w:tcW w:type="dxa" w:w="2160"/>
-          </w:tcPr>
-          <w:p>
-            <w:r>
-              <w:t>₹37,975</w:t>
-            </w:r>
-          </w:p>
-        </w:tc>
-        <w:tc>
-          <w:tcPr>
-            <w:tcW w:type="dxa" w:w="2160"/>
-          </w:tcPr>
-          <w:p>
-            <w:r>
-              <w:t>₹19,695</w:t>
-            </w:r>
-          </w:p>
-        </w:tc>
-        <w:tc>
-          <w:tcPr>
-            <w:tcW w:type="dxa" w:w="2160"/>
-          </w:tcPr>
-          <w:p>
-            <w:r>
-              <w:t>—</w:t>
-            </w:r>
-          </w:p>
-        </w:tc>
-      </w:tr>
-    </w:tbl>
-    <w:p/>
-    <w:p>
-      <w:pPr>
-        <w:pStyle w:val="Heading3"/>
-      </w:pPr>
-      <w:r>
-        <w:t>Available BHK Mix</w:t>
-      </w:r>
-    </w:p>
-    <w:p>
-      <w:r>
-        <w:t>The Available BHK Mix table for Andheri West in Mumbai's Western Suburbs shows the distribution of resale home configurations. The most common option is 3 BHK with 789 listings, followed by 2 BHK at 579 units. Smaller and larger units like 1 BHK, 4 BHK, and 5 BHK are also present, with counts ranging from 54 to 141. This breakdown helps buyers understand the variety of home sizes currently available in this locality.</w:t>
-      </w:r>
-    </w:p>
-    <w:tbl>
-      <w:tblPr>
-        <w:tblStyle w:val="TableGrid"/>
-        <w:tblW w:type="auto" w:w="0"/>
-        <w:tblLook w:firstColumn="1" w:firstRow="1" w:lastColumn="0" w:lastRow="0" w:noHBand="0" w:noVBand="1" w:val="04A0"/>
-      </w:tblPr>
-      <w:tblGrid>
-        <w:gridCol w:w="4320"/>
-        <w:gridCol w:w="4320"/>
-      </w:tblGrid>
-      <w:tr>
-        <w:tc>
-          <w:tcPr>
-            <w:tcW w:type="dxa" w:w="4320"/>
-          </w:tcPr>
-          <w:p>
-            <w:r>
-              <w:t>key</w:t>
-            </w:r>
-          </w:p>
-        </w:tc>
-        <w:tc>
-          <w:tcPr>
-            <w:tcW w:type="dxa" w:w="4320"/>
-          </w:tcPr>
-          <w:p>
-            <w:r>
-              <w:t>doc_count</w:t>
-            </w:r>
-          </w:p>
-        </w:tc>
-      </w:tr>
-      <w:tr>
-        <w:tc>
-          <w:tcPr>
-            <w:tcW w:type="dxa" w:w="4320"/>
-          </w:tcPr>
-          <w:p>
-            <w:r>
-              <w:t>3 BHK</w:t>
-            </w:r>
-          </w:p>
-        </w:tc>
-        <w:tc>
-          <w:tcPr>
-            <w:tcW w:type="dxa" w:w="4320"/>
-          </w:tcPr>
-          <w:p>
-            <w:r>
-              <w:t>789</w:t>
-            </w:r>
-          </w:p>
-        </w:tc>
-      </w:tr>
-      <w:tr>
-        <w:tc>
-          <w:tcPr>
-            <w:tcW w:type="dxa" w:w="4320"/>
-          </w:tcPr>
-          <w:p>
-            <w:r>
-              <w:t>2 BHK</w:t>
-            </w:r>
-          </w:p>
-        </w:tc>
-        <w:tc>
-          <w:tcPr>
-            <w:tcW w:type="dxa" w:w="4320"/>
-          </w:tcPr>
-          <w:p>
-            <w:r>
-              <w:t>579</w:t>
-            </w:r>
-          </w:p>
-        </w:tc>
-      </w:tr>
-      <w:tr>
-        <w:tc>
-          <w:tcPr>
-            <w:tcW w:type="dxa" w:w="4320"/>
-          </w:tcPr>
-          <w:p>
-            <w:r>
-              <w:t>4 BHK</w:t>
-            </w:r>
-          </w:p>
-        </w:tc>
-        <w:tc>
-          <w:tcPr>
-            <w:tcW w:type="dxa" w:w="4320"/>
-          </w:tcPr>
-          <w:p>
-            <w:r>
-              <w:t>188</w:t>
-            </w:r>
-          </w:p>
-        </w:tc>
-      </w:tr>
-      <w:tr>
-        <w:tc>
-          <w:tcPr>
-            <w:tcW w:type="dxa" w:w="4320"/>
-          </w:tcPr>
-          <w:p>
-            <w:r>
-              <w:t>1 BHK</w:t>
-            </w:r>
-          </w:p>
-        </w:tc>
-        <w:tc>
-          <w:tcPr>
-            <w:tcW w:type="dxa" w:w="4320"/>
-          </w:tcPr>
-          <w:p>
-            <w:r>
-              <w:t>141</w:t>
-            </w:r>
-          </w:p>
-        </w:tc>
-      </w:tr>
-      <w:tr>
-        <w:tc>
-          <w:tcPr>
-            <w:tcW w:type="dxa" w:w="4320"/>
-          </w:tcPr>
-          <w:p>
-            <w:r>
-              <w:t>5 BHK</w:t>
-            </w:r>
-          </w:p>
-        </w:tc>
-        <w:tc>
-          <w:tcPr>
-            <w:tcW w:type="dxa" w:w="4320"/>
-          </w:tcPr>
-          <w:p>
-            <w:r>
-              <w:t>54</w:t>
-            </w:r>
-          </w:p>
-        </w:tc>
-      </w:tr>
-      <w:tr>
-        <w:tc>
-          <w:tcPr>
-            <w:tcW w:type="dxa" w:w="4320"/>
-          </w:tcPr>
-          <w:p>
-            <w:r>
-              <w:t>1 RK</w:t>
-            </w:r>
-          </w:p>
-        </w:tc>
-        <w:tc>
-          <w:tcPr>
-            <w:tcW w:type="dxa" w:w="4320"/>
-          </w:tcPr>
-          <w:p>
-            <w:r>
-              <w:t>15</w:t>
-            </w:r>
-          </w:p>
-        </w:tc>
-      </w:tr>
-      <w:tr>
-        <w:tc>
-          <w:tcPr>
-            <w:tcW w:type="dxa" w:w="4320"/>
-          </w:tcPr>
-          <w:p>
-            <w:r>
-              <w:t>6 BHK</w:t>
-            </w:r>
-          </w:p>
-        </w:tc>
-        <w:tc>
-          <w:tcPr>
-            <w:tcW w:type="dxa" w:w="4320"/>
-          </w:tcPr>
-          <w:p>
-            <w:r>
-              <w:t>13</w:t>
-            </w:r>
-          </w:p>
-        </w:tc>
-      </w:tr>
-      <w:tr>
-        <w:tc>
-          <w:tcPr>
-            <w:tcW w:type="dxa" w:w="4320"/>
-          </w:tcPr>
-          <w:p>
-            <w:r>
-              <w:t>Studio</w:t>
-            </w:r>
-          </w:p>
-        </w:tc>
-        <w:tc>
-          <w:tcPr>
-            <w:tcW w:type="dxa" w:w="4320"/>
-          </w:tcPr>
-          <w:p>
-            <w:r>
-              <w:t>1</w:t>
-            </w:r>
-          </w:p>
-        </w:tc>
-      </w:tr>
-    </w:tbl>
-    <w:p/>
-    <w:p>
-      <w:pPr>
-        <w:pStyle w:val="Heading3"/>
-      </w:pPr>
-      <w:r>
-        <w:t>Nearby Localities to Explore</w:t>
-      </w:r>
-    </w:p>
-    <w:p>
-      <w:r>
-        <w:t>The table 'Nearby Localities to Explore' lists localities close to Andheri West in Mumbai, highlighting resale inventory and average price per square foot. For example, Mudran Press Colony is just 0.30 km away with 11 resale listings averaging ₹45,336.55 per sqft, while Sv Patel Nagar, 0.59 km away, has the highest sale count of 38 but a lower average price of ₹29,775.32 per sqft. This information helps compare nearby options based on proximity, availability, and pricing for resale properties.</w:t>
-      </w:r>
-    </w:p>
-    <w:tbl>
-      <w:tblPr>
-        <w:tblStyle w:val="TableGrid"/>
-        <w:tblW w:type="auto" w:w="0"/>
-        <w:tblLook w:firstColumn="1" w:firstRow="1" w:lastColumn="0" w:lastRow="0" w:noHBand="0" w:noVBand="1" w:val="04A0"/>
-      </w:tblPr>
-      <w:tblGrid>
-        <w:gridCol w:w="1728"/>
-        <w:gridCol w:w="1728"/>
-        <w:gridCol w:w="1728"/>
-        <w:gridCol w:w="1728"/>
-        <w:gridCol w:w="1728"/>
-      </w:tblGrid>
-      <w:tr>
-        <w:tc>
-          <w:tcPr>
-            <w:tcW w:type="dxa" w:w="1728"/>
-          </w:tcPr>
-          <w:p>
-            <w:r>
-              <w:t>name</w:t>
-            </w:r>
-          </w:p>
-        </w:tc>
-        <w:tc>
-          <w:tcPr>
-            <w:tcW w:type="dxa" w:w="1728"/>
-          </w:tcPr>
-          <w:p>
-            <w:r>
-              <w:t>distance_km</w:t>
-            </w:r>
-          </w:p>
-        </w:tc>
-        <w:tc>
-          <w:tcPr>
-            <w:tcW w:type="dxa" w:w="1728"/>
-          </w:tcPr>
-          <w:p>
-            <w:r>
-              <w:t>sale_count</w:t>
-            </w:r>
-          </w:p>
-        </w:tc>
-        <w:tc>
-          <w:tcPr>
-            <w:tcW w:type="dxa" w:w="1728"/>
-          </w:tcPr>
-          <w:p>
-            <w:r>
-              <w:t>sale_avg_price_per_sqft</w:t>
-            </w:r>
-          </w:p>
-        </w:tc>
-        <w:tc>
-          <w:tcPr>
-            <w:tcW w:type="dxa" w:w="1728"/>
-          </w:tcPr>
-          <w:p>
-            <w:r>
-              <w:t>url</w:t>
-            </w:r>
-          </w:p>
-        </w:tc>
-      </w:tr>
-      <w:tr>
-        <w:tc>
-          <w:tcPr>
-            <w:tcW w:type="dxa" w:w="1728"/>
-          </w:tcPr>
-          <w:p>
-            <w:r>
-              <w:t>Mudran Press Colony</w:t>
-            </w:r>
-          </w:p>
-        </w:tc>
-        <w:tc>
-          <w:tcPr>
-            <w:tcW w:type="dxa" w:w="1728"/>
-          </w:tcPr>
-          <w:p>
-            <w:r>
-              <w:t>0.30 km</w:t>
-            </w:r>
-          </w:p>
-        </w:tc>
-        <w:tc>
-          <w:tcPr>
-            <w:tcW w:type="dxa" w:w="1728"/>
-          </w:tcPr>
-          <w:p>
-            <w:r>
-              <w:t>11</w:t>
-            </w:r>
-          </w:p>
-        </w:tc>
-        <w:tc>
-          <w:tcPr>
-            <w:tcW w:type="dxa" w:w="1728"/>
-          </w:tcPr>
-          <w:p>
-            <w:r>
-              <w:t>₹45,336.55</w:t>
-            </w:r>
-          </w:p>
-        </w:tc>
-        <w:tc>
-          <w:tcPr>
-            <w:tcW w:type="dxa" w:w="1728"/>
-          </w:tcPr>
-          <w:p>
-            <w:r>
-              <w:t>https://www.squareyards.com/mudran-press-colony-mumbai</w:t>
-            </w:r>
-          </w:p>
-        </w:tc>
-      </w:tr>
-      <w:tr>
-        <w:tc>
-          <w:tcPr>
-            <w:tcW w:type="dxa" w:w="1728"/>
-          </w:tcPr>
-          <w:p>
-            <w:r>
-              <w:t>Suresh Nagar</w:t>
-            </w:r>
-          </w:p>
-        </w:tc>
-        <w:tc>
-          <w:tcPr>
-            <w:tcW w:type="dxa" w:w="1728"/>
-          </w:tcPr>
-          <w:p>
-            <w:r>
-              <w:t>0.39 km</w:t>
-            </w:r>
-          </w:p>
-        </w:tc>
-        <w:tc>
-          <w:tcPr>
-            <w:tcW w:type="dxa" w:w="1728"/>
-          </w:tcPr>
-          <w:p>
-            <w:r>
-              <w:t>4</w:t>
-            </w:r>
-          </w:p>
-        </w:tc>
-        <w:tc>
-          <w:tcPr>
-            <w:tcW w:type="dxa" w:w="1728"/>
-          </w:tcPr>
-          <w:p>
-            <w:r>
-              <w:t>₹40,345.25</w:t>
-            </w:r>
-          </w:p>
-        </w:tc>
-        <w:tc>
-          <w:tcPr>
-            <w:tcW w:type="dxa" w:w="1728"/>
-          </w:tcPr>
-          <w:p>
-            <w:r>
-              <w:t>https://www.squareyards.com/suresh-nagar-mumbai</w:t>
-            </w:r>
-          </w:p>
-        </w:tc>
-      </w:tr>
-      <w:tr>
-        <w:tc>
-          <w:tcPr>
-            <w:tcW w:type="dxa" w:w="1728"/>
-          </w:tcPr>
-          <w:p>
-            <w:r>
-              <w:t>Bhudargarh Colony</w:t>
-            </w:r>
-          </w:p>
-        </w:tc>
-        <w:tc>
-          <w:tcPr>
-            <w:tcW w:type="dxa" w:w="1728"/>
-          </w:tcPr>
-          <w:p>
-            <w:r>
-              <w:t>0.48 km</w:t>
-            </w:r>
-          </w:p>
-        </w:tc>
-        <w:tc>
-          <w:tcPr>
-            <w:tcW w:type="dxa" w:w="1728"/>
-          </w:tcPr>
-          <w:p>
-            <w:r>
-              <w:t>5</w:t>
-            </w:r>
-          </w:p>
-        </w:tc>
-        <w:tc>
-          <w:tcPr>
-            <w:tcW w:type="dxa" w:w="1728"/>
-          </w:tcPr>
-          <w:p>
-            <w:r>
-              <w:t>₹41,805.60</w:t>
-            </w:r>
-          </w:p>
-        </w:tc>
-        <w:tc>
-          <w:tcPr>
-            <w:tcW w:type="dxa" w:w="1728"/>
-          </w:tcPr>
-          <w:p>
-            <w:r>
-              <w:t>https://www.squareyards.com/bhudargarh-colony-mumbai</w:t>
-            </w:r>
-          </w:p>
-        </w:tc>
-      </w:tr>
-      <w:tr>
-        <w:tc>
-          <w:tcPr>
-            <w:tcW w:type="dxa" w:w="1728"/>
-          </w:tcPr>
-          <w:p>
-            <w:r>
-              <w:t>Laxmi Industrial Estate</w:t>
-            </w:r>
-          </w:p>
-        </w:tc>
-        <w:tc>
-          <w:tcPr>
-            <w:tcW w:type="dxa" w:w="1728"/>
-          </w:tcPr>
-          <w:p>
-            <w:r>
-              <w:t>0.49 km</w:t>
-            </w:r>
-          </w:p>
-        </w:tc>
-        <w:tc>
-          <w:tcPr>
-            <w:tcW w:type="dxa" w:w="1728"/>
-          </w:tcPr>
-          <w:p>
-            <w:r>
-              <w:t>—</w:t>
-            </w:r>
-          </w:p>
-        </w:tc>
-        <w:tc>
-          <w:tcPr>
-            <w:tcW w:type="dxa" w:w="1728"/>
-          </w:tcPr>
-          <w:p>
-            <w:r>
-              <w:t>—</w:t>
-            </w:r>
-          </w:p>
-        </w:tc>
-        <w:tc>
-          <w:tcPr>
-            <w:tcW w:type="dxa" w:w="1728"/>
-          </w:tcPr>
-          <w:p>
-            <w:r>
-              <w:t>https://www.squareyards.com/laxmi-industrial-estate-mumbai</w:t>
-            </w:r>
-          </w:p>
-        </w:tc>
-      </w:tr>
-      <w:tr>
-        <w:tc>
-          <w:tcPr>
-            <w:tcW w:type="dxa" w:w="1728"/>
-          </w:tcPr>
-          <w:p>
-            <w:r>
-              <w:t>Sv Patel Nagar</w:t>
-            </w:r>
-          </w:p>
-        </w:tc>
-        <w:tc>
-          <w:tcPr>
-            <w:tcW w:type="dxa" w:w="1728"/>
-          </w:tcPr>
-          <w:p>
-            <w:r>
-              <w:t>0.59 km</w:t>
-            </w:r>
-          </w:p>
-        </w:tc>
-        <w:tc>
-          <w:tcPr>
-            <w:tcW w:type="dxa" w:w="1728"/>
-          </w:tcPr>
-          <w:p>
-            <w:r>
-              <w:t>38</w:t>
-            </w:r>
-          </w:p>
-        </w:tc>
-        <w:tc>
-          <w:tcPr>
-            <w:tcW w:type="dxa" w:w="1728"/>
-          </w:tcPr>
-          <w:p>
-            <w:r>
-              <w:t>₹29,775.32</w:t>
-            </w:r>
-          </w:p>
-        </w:tc>
-        <w:tc>
-          <w:tcPr>
-            <w:tcW w:type="dxa" w:w="1728"/>
-          </w:tcPr>
-          <w:p>
-            <w:r>
-              <w:t>https://www.squareyards.com/sv-patel-nagar-mumbai</w:t>
-            </w:r>
-          </w:p>
-        </w:tc>
-      </w:tr>
-      <w:tr>
-        <w:tc>
-          <w:tcPr>
-            <w:tcW w:type="dxa" w:w="1728"/>
-          </w:tcPr>
-          <w:p>
-            <w:r>
-              <w:t>Manish Nagar</w:t>
-            </w:r>
-          </w:p>
-        </w:tc>
-        <w:tc>
-          <w:tcPr>
-            <w:tcW w:type="dxa" w:w="1728"/>
-          </w:tcPr>
-          <w:p>
-            <w:r>
-              <w:t>0.70 km</w:t>
-            </w:r>
-          </w:p>
-        </w:tc>
-        <w:tc>
-          <w:tcPr>
-            <w:tcW w:type="dxa" w:w="1728"/>
-          </w:tcPr>
-          <w:p>
-            <w:r>
-              <w:t>5</w:t>
-            </w:r>
-          </w:p>
-        </w:tc>
-        <w:tc>
-          <w:tcPr>
-            <w:tcW w:type="dxa" w:w="1728"/>
-          </w:tcPr>
-          <w:p>
-            <w:r>
-              <w:t>₹40,609</w:t>
-            </w:r>
-          </w:p>
-        </w:tc>
-        <w:tc>
-          <w:tcPr>
-            <w:tcW w:type="dxa" w:w="1728"/>
-          </w:tcPr>
-          <w:p>
-            <w:r>
-              <w:t>https://www.squareyards.com/manish-nagar-mumbai</w:t>
-            </w:r>
-          </w:p>
-        </w:tc>
-      </w:tr>
-      <w:tr>
-        <w:tc>
-          <w:tcPr>
-            <w:tcW w:type="dxa" w:w="1728"/>
-          </w:tcPr>
-          <w:p>
-            <w:r>
-              <w:t>Shashtri Nagar</w:t>
-            </w:r>
-          </w:p>
-        </w:tc>
-        <w:tc>
-          <w:tcPr>
-            <w:tcW w:type="dxa" w:w="1728"/>
-          </w:tcPr>
-          <w:p>
-            <w:r>
-              <w:t>0.70 km</w:t>
-            </w:r>
-          </w:p>
-        </w:tc>
-        <w:tc>
-          <w:tcPr>
-            <w:tcW w:type="dxa" w:w="1728"/>
-          </w:tcPr>
-          <w:p>
-            <w:r>
-              <w:t>17</w:t>
-            </w:r>
-          </w:p>
-        </w:tc>
-        <w:tc>
-          <w:tcPr>
-            <w:tcW w:type="dxa" w:w="1728"/>
-          </w:tcPr>
-          <w:p>
-            <w:r>
-              <w:t>₹45,055.57</w:t>
-            </w:r>
-          </w:p>
-        </w:tc>
-        <w:tc>
-          <w:tcPr>
-            <w:tcW w:type="dxa" w:w="1728"/>
-          </w:tcPr>
-          <w:p>
-            <w:r>
-              <w:t>https://www.squareyards.com/shashtri-nagar-mumbai</w:t>
-            </w:r>
-          </w:p>
-        </w:tc>
-      </w:tr>
-      <w:tr>
-        <w:tc>
-          <w:tcPr>
-            <w:tcW w:type="dxa" w:w="1728"/>
-          </w:tcPr>
-          <w:p>
-            <w:r>
-              <w:t>Seven Bunglow</w:t>
-            </w:r>
-          </w:p>
-        </w:tc>
-        <w:tc>
-          <w:tcPr>
-            <w:tcW w:type="dxa" w:w="1728"/>
-          </w:tcPr>
-          <w:p>
-            <w:r>
-              <w:t>0.78 km</w:t>
-            </w:r>
-          </w:p>
-        </w:tc>
-        <w:tc>
-          <w:tcPr>
-            <w:tcW w:type="dxa" w:w="1728"/>
-          </w:tcPr>
-          <w:p>
-            <w:r>
-              <w:t>4</w:t>
-            </w:r>
-          </w:p>
-        </w:tc>
-        <w:tc>
-          <w:tcPr>
-            <w:tcW w:type="dxa" w:w="1728"/>
-          </w:tcPr>
-          <w:p>
-            <w:r>
-              <w:t>₹60,820.75</w:t>
-            </w:r>
-          </w:p>
-        </w:tc>
-        <w:tc>
-          <w:tcPr>
-            <w:tcW w:type="dxa" w:w="1728"/>
-          </w:tcPr>
-          <w:p>
-            <w:r>
-              <w:t>https://www.squareyards.com/seven-bunglow-mumbai</w:t>
-            </w:r>
-          </w:p>
-        </w:tc>
-      </w:tr>
-      <w:tr>
-        <w:tc>
-          <w:tcPr>
-            <w:tcW w:type="dxa" w:w="1728"/>
-          </w:tcPr>
-          <w:p>
-            <w:r>
-              <w:t>Jeevan Nagar</w:t>
-            </w:r>
-          </w:p>
-        </w:tc>
-        <w:tc>
-          <w:tcPr>
-            <w:tcW w:type="dxa" w:w="1728"/>
-          </w:tcPr>
-          <w:p>
-            <w:r>
-              <w:t>0.98 km</w:t>
-            </w:r>
-          </w:p>
-        </w:tc>
-        <w:tc>
-          <w:tcPr>
-            <w:tcW w:type="dxa" w:w="1728"/>
-          </w:tcPr>
-          <w:p>
-            <w:r>
-              <w:t>5</w:t>
-            </w:r>
-          </w:p>
-        </w:tc>
-        <w:tc>
-          <w:tcPr>
-            <w:tcW w:type="dxa" w:w="1728"/>
-          </w:tcPr>
-          <w:p>
-            <w:r>
-              <w:t>₹37,961.80</w:t>
-            </w:r>
-          </w:p>
-        </w:tc>
-        <w:tc>
-          <w:tcPr>
-            <w:tcW w:type="dxa" w:w="1728"/>
-          </w:tcPr>
-          <w:p>
-            <w:r>
-              <w:t>https://www.squareyards.com/jeevan-nagar-mumbai</w:t>
-            </w:r>
-          </w:p>
-        </w:tc>
-      </w:tr>
-      <w:tr>
-        <w:tc>
-          <w:tcPr>
-            <w:tcW w:type="dxa" w:w="1728"/>
-          </w:tcPr>
-          <w:p>
-            <w:r>
-              <w:t>Industrial Area</w:t>
-            </w:r>
-          </w:p>
-        </w:tc>
-        <w:tc>
-          <w:tcPr>
-            <w:tcW w:type="dxa" w:w="1728"/>
-          </w:tcPr>
-          <w:p>
-            <w:r>
-              <w:t>1.00 km</w:t>
-            </w:r>
-          </w:p>
-        </w:tc>
-        <w:tc>
-          <w:tcPr>
-            <w:tcW w:type="dxa" w:w="1728"/>
-          </w:tcPr>
-          <w:p>
-            <w:r>
-              <w:t>1</w:t>
-            </w:r>
-          </w:p>
-        </w:tc>
-        <w:tc>
-          <w:tcPr>
-            <w:tcW w:type="dxa" w:w="1728"/>
-          </w:tcPr>
-          <w:p>
-            <w:r>
-              <w:t>₹37,000</w:t>
-            </w:r>
-          </w:p>
-        </w:tc>
-        <w:tc>
-          <w:tcPr>
-            <w:tcW w:type="dxa" w:w="1728"/>
-          </w:tcPr>
-          <w:p>
-            <w:r>
-              <w:t>https://www.squareyards.com/industrial-area-mumbai</w:t>
-            </w:r>
-          </w:p>
-        </w:tc>
-      </w:tr>
-    </w:tbl>
-    <w:p/>
-    <w:p>
-      <w:pPr>
-        <w:pStyle w:val="Heading3"/>
-      </w:pPr>
-      <w:r>
-        <w:t>Location Rate Snapshot</w:t>
-      </w:r>
-    </w:p>
-    <w:p>
-      <w:r>
-        <w:t>The Location Rate Snapshot table provides average resale property rates for various local pockets around Andheri West in Mumbai's Western Suburbs. For example, Veera Desai Road has an average rate of ₹33,765 with no recent change, while Juhu shows a higher average rate of ₹60,242 and a 2.89% increase. Notably, Vile Parle West experienced the largest rise at 7.75%, reaching ₹48,142. This data highlights the price variations across nearby localities, offering clear, grounded insights into current resale market rates.</w:t>
-      </w:r>
-    </w:p>
-    <w:tbl>
-      <w:tblPr>
-        <w:tblStyle w:val="TableGrid"/>
-        <w:tblW w:type="auto" w:w="0"/>
-        <w:tblLook w:firstColumn="1" w:firstRow="1" w:lastColumn="0" w:lastRow="0" w:noHBand="0" w:noVBand="1" w:val="04A0"/>
-      </w:tblPr>
-      <w:tblGrid>
-        <w:gridCol w:w="2880"/>
-        <w:gridCol w:w="2880"/>
-        <w:gridCol w:w="2880"/>
-      </w:tblGrid>
-      <w:tr>
-        <w:tc>
-          <w:tcPr>
-            <w:tcW w:type="dxa" w:w="2880"/>
-          </w:tcPr>
-          <w:p>
-            <w:r>
-              <w:t>name</w:t>
-            </w:r>
-          </w:p>
-        </w:tc>
-        <w:tc>
-          <w:tcPr>
-            <w:tcW w:type="dxa" w:w="2880"/>
-          </w:tcPr>
-          <w:p>
-            <w:r>
-              <w:t>avgRate</w:t>
-            </w:r>
-          </w:p>
-        </w:tc>
-        <w:tc>
-          <w:tcPr>
-            <w:tcW w:type="dxa" w:w="2880"/>
-          </w:tcPr>
-          <w:p>
-            <w:r>
-              <w:t>changePercentage</w:t>
-            </w:r>
-          </w:p>
-        </w:tc>
-      </w:tr>
-      <w:tr>
-        <w:tc>
-          <w:tcPr>
-            <w:tcW w:type="dxa" w:w="2880"/>
-          </w:tcPr>
-          <w:p>
-            <w:r>
-              <w:t>Veera Desai Road</w:t>
-            </w:r>
-          </w:p>
-        </w:tc>
-        <w:tc>
-          <w:tcPr>
-            <w:tcW w:type="dxa" w:w="2880"/>
-          </w:tcPr>
-          <w:p>
-            <w:r>
-              <w:t>₹33,765</w:t>
-            </w:r>
-          </w:p>
-        </w:tc>
-        <w:tc>
-          <w:tcPr>
-            <w:tcW w:type="dxa" w:w="2880"/>
-          </w:tcPr>
-          <w:p>
-            <w:r>
-              <w:t>0.00%</w:t>
-            </w:r>
-          </w:p>
-        </w:tc>
-      </w:tr>
-      <w:tr>
-        <w:tc>
-          <w:tcPr>
-            <w:tcW w:type="dxa" w:w="2880"/>
-          </w:tcPr>
-          <w:p>
-            <w:r>
-              <w:t>Yari Road</w:t>
-            </w:r>
-          </w:p>
-        </w:tc>
-        <w:tc>
-          <w:tcPr>
-            <w:tcW w:type="dxa" w:w="2880"/>
-          </w:tcPr>
-          <w:p>
-            <w:r>
-              <w:t>₹32,638</w:t>
-            </w:r>
-          </w:p>
-        </w:tc>
-        <w:tc>
-          <w:tcPr>
-            <w:tcW w:type="dxa" w:w="2880"/>
-          </w:tcPr>
-          <w:p>
-            <w:r>
-              <w:t>0.00%</w:t>
-            </w:r>
-          </w:p>
-        </w:tc>
-      </w:tr>
-      <w:tr>
-        <w:tc>
-          <w:tcPr>
-            <w:tcW w:type="dxa" w:w="2880"/>
-          </w:tcPr>
-          <w:p>
-            <w:r>
-              <w:t>Jogeshwari West</w:t>
-            </w:r>
-          </w:p>
-        </w:tc>
-        <w:tc>
-          <w:tcPr>
-            <w:tcW w:type="dxa" w:w="2880"/>
-          </w:tcPr>
-          <w:p>
-            <w:r>
-              <w:t>₹28,345</w:t>
-            </w:r>
-          </w:p>
-        </w:tc>
-        <w:tc>
-          <w:tcPr>
-            <w:tcW w:type="dxa" w:w="2880"/>
-          </w:tcPr>
-          <w:p>
-            <w:r>
-              <w:t>-2.56%</w:t>
-            </w:r>
-          </w:p>
-        </w:tc>
-      </w:tr>
-      <w:tr>
-        <w:tc>
-          <w:tcPr>
-            <w:tcW w:type="dxa" w:w="2880"/>
-          </w:tcPr>
-          <w:p>
-            <w:r>
-              <w:t>Gulmohar Road</w:t>
-            </w:r>
-          </w:p>
-        </w:tc>
-        <w:tc>
-          <w:tcPr>
-            <w:tcW w:type="dxa" w:w="2880"/>
-          </w:tcPr>
-          <w:p>
-            <w:r>
-              <w:t>₹57,726</w:t>
-            </w:r>
-          </w:p>
-        </w:tc>
-        <w:tc>
-          <w:tcPr>
-            <w:tcW w:type="dxa" w:w="2880"/>
-          </w:tcPr>
-          <w:p>
-            <w:r>
-              <w:t>0.18%</w:t>
-            </w:r>
-          </w:p>
-        </w:tc>
-      </w:tr>
-      <w:tr>
-        <w:tc>
-          <w:tcPr>
-            <w:tcW w:type="dxa" w:w="2880"/>
-          </w:tcPr>
-          <w:p>
-            <w:r>
-              <w:t>Juhu</w:t>
-            </w:r>
-          </w:p>
-        </w:tc>
-        <w:tc>
-          <w:tcPr>
-            <w:tcW w:type="dxa" w:w="2880"/>
-          </w:tcPr>
-          <w:p>
-            <w:r>
-              <w:t>₹60,242</w:t>
-            </w:r>
-          </w:p>
-        </w:tc>
-        <w:tc>
-          <w:tcPr>
-            <w:tcW w:type="dxa" w:w="2880"/>
-          </w:tcPr>
-          <w:p>
-            <w:r>
-              <w:t>2.89%</w:t>
-            </w:r>
-          </w:p>
-        </w:tc>
-      </w:tr>
-      <w:tr>
-        <w:tc>
-          <w:tcPr>
-            <w:tcW w:type="dxa" w:w="2880"/>
-          </w:tcPr>
-          <w:p>
-            <w:r>
-              <w:t>Goregaon West</w:t>
-            </w:r>
-          </w:p>
-        </w:tc>
-        <w:tc>
-          <w:tcPr>
-            <w:tcW w:type="dxa" w:w="2880"/>
-          </w:tcPr>
-          <w:p>
-            <w:r>
-              <w:t>₹33,246</w:t>
-            </w:r>
-          </w:p>
-        </w:tc>
-        <w:tc>
-          <w:tcPr>
-            <w:tcW w:type="dxa" w:w="2880"/>
-          </w:tcPr>
-          <w:p>
-            <w:r>
-              <w:t>1.94%</w:t>
-            </w:r>
-          </w:p>
-        </w:tc>
-      </w:tr>
-      <w:tr>
-        <w:tc>
-          <w:tcPr>
-            <w:tcW w:type="dxa" w:w="2880"/>
-          </w:tcPr>
-          <w:p>
-            <w:r>
-              <w:t>Jogeshwari East</w:t>
-            </w:r>
-          </w:p>
-        </w:tc>
-        <w:tc>
-          <w:tcPr>
-            <w:tcW w:type="dxa" w:w="2880"/>
-          </w:tcPr>
-          <w:p>
-            <w:r>
-              <w:t>₹27,078</w:t>
-            </w:r>
-          </w:p>
-        </w:tc>
-        <w:tc>
-          <w:tcPr>
-            <w:tcW w:type="dxa" w:w="2880"/>
-          </w:tcPr>
-          <w:p>
-            <w:r>
-              <w:t>2.28%</w:t>
-            </w:r>
-          </w:p>
-        </w:tc>
-      </w:tr>
-      <w:tr>
-        <w:tc>
-          <w:tcPr>
-            <w:tcW w:type="dxa" w:w="2880"/>
-          </w:tcPr>
-          <w:p>
-            <w:r>
-              <w:t>Juhu Road</w:t>
-            </w:r>
-          </w:p>
-        </w:tc>
-        <w:tc>
-          <w:tcPr>
-            <w:tcW w:type="dxa" w:w="2880"/>
-          </w:tcPr>
-          <w:p>
-            <w:r>
-              <w:t>₹45,398</w:t>
-            </w:r>
-          </w:p>
-        </w:tc>
-        <w:tc>
-          <w:tcPr>
-            <w:tcW w:type="dxa" w:w="2880"/>
-          </w:tcPr>
-          <w:p>
-            <w:r>
-              <w:t>0.00%</w:t>
-            </w:r>
-          </w:p>
-        </w:tc>
-      </w:tr>
-      <w:tr>
-        <w:tc>
-          <w:tcPr>
-            <w:tcW w:type="dxa" w:w="2880"/>
-          </w:tcPr>
-          <w:p>
-            <w:r>
-              <w:t>Madh</w:t>
-            </w:r>
-          </w:p>
-        </w:tc>
-        <w:tc>
-          <w:tcPr>
-            <w:tcW w:type="dxa" w:w="2880"/>
-          </w:tcPr>
-          <w:p>
-            <w:r>
-              <w:t>₹27,303</w:t>
-            </w:r>
-          </w:p>
-        </w:tc>
-        <w:tc>
-          <w:tcPr>
-            <w:tcW w:type="dxa" w:w="2880"/>
-          </w:tcPr>
-          <w:p>
-            <w:r>
-              <w:t>-0.65%</w:t>
-            </w:r>
-          </w:p>
-        </w:tc>
-      </w:tr>
-      <w:tr>
-        <w:tc>
-          <w:tcPr>
-            <w:tcW w:type="dxa" w:w="2880"/>
-          </w:tcPr>
-          <w:p>
-            <w:r>
-              <w:t>Vile Parle West</w:t>
-            </w:r>
-          </w:p>
-        </w:tc>
-        <w:tc>
-          <w:tcPr>
-            <w:tcW w:type="dxa" w:w="2880"/>
-          </w:tcPr>
-          <w:p>
-            <w:r>
-              <w:t>₹48,142</w:t>
-            </w:r>
-          </w:p>
-        </w:tc>
-        <w:tc>
-          <w:tcPr>
-            <w:tcW w:type="dxa" w:w="2880"/>
-          </w:tcPr>
-          <w:p>
-            <w:r>
-              <w:t>7.75%</w:t>
-            </w:r>
-          </w:p>
-        </w:tc>
-      </w:tr>
-    </w:tbl>
-    <w:p/>
-    <w:p>
-      <w:pPr>
-        <w:pStyle w:val="Heading3"/>
-      </w:pPr>
-      <w:r>
-        <w:t>Property Type Rate Snapshot</w:t>
-      </w:r>
-    </w:p>
-    <w:p>
-      <w:r>
-        <w:t>The Property Type Rate Snapshot for Andheri West in Mumbai's Western Suburbs highlights average prices and recent changes across key property categories. Shops have the highest average price at ₹78,643 per square foot but experienced a 6.11% decrease. Office spaces and villas show moderate average prices of ₹45,508 and ₹51,864 respectively, with positive price changes of 2.68% and 3.63%. Apartments are priced at ₹40,238 on average, reflecting a 4.61% increase, indicating varied pricing trends across property types in this locality.</w:t>
-      </w:r>
-    </w:p>
-    <w:tbl>
-      <w:tblPr>
-        <w:tblStyle w:val="TableGrid"/>
-        <w:tblW w:type="auto" w:w="0"/>
-        <w:tblLook w:firstColumn="1" w:firstRow="1" w:lastColumn="0" w:lastRow="0" w:noHBand="0" w:noVBand="1" w:val="04A0"/>
-      </w:tblPr>
-      <w:tblGrid>
-        <w:gridCol w:w="2880"/>
-        <w:gridCol w:w="2880"/>
-        <w:gridCol w:w="2880"/>
-      </w:tblGrid>
-      <w:tr>
-        <w:tc>
-          <w:tcPr>
-            <w:tcW w:type="dxa" w:w="2880"/>
-          </w:tcPr>
-          <w:p>
-            <w:r>
-              <w:t>propertyType</w:t>
-            </w:r>
-          </w:p>
-        </w:tc>
-        <w:tc>
-          <w:tcPr>
-            <w:tcW w:type="dxa" w:w="2880"/>
-          </w:tcPr>
-          <w:p>
-            <w:r>
-              <w:t>avgPrice</w:t>
-            </w:r>
-          </w:p>
-        </w:tc>
-        <w:tc>
-          <w:tcPr>
-            <w:tcW w:type="dxa" w:w="2880"/>
-          </w:tcPr>
-          <w:p>
-            <w:r>
-              <w:t>changePercent</w:t>
-            </w:r>
-          </w:p>
-        </w:tc>
-      </w:tr>
-      <w:tr>
-        <w:tc>
-          <w:tcPr>
-            <w:tcW w:type="dxa" w:w="2880"/>
-          </w:tcPr>
-          <w:p>
-            <w:r>
-              <w:t>shop</w:t>
-            </w:r>
-          </w:p>
-        </w:tc>
-        <w:tc>
-          <w:tcPr>
-            <w:tcW w:type="dxa" w:w="2880"/>
-          </w:tcPr>
-          <w:p>
-            <w:r>
-              <w:t>₹78,643</w:t>
-            </w:r>
-          </w:p>
-        </w:tc>
-        <w:tc>
-          <w:tcPr>
-            <w:tcW w:type="dxa" w:w="2880"/>
-          </w:tcPr>
-          <w:p>
-            <w:r>
-              <w:t>-6.11%</w:t>
-            </w:r>
-          </w:p>
-        </w:tc>
-      </w:tr>
-      <w:tr>
-        <w:tc>
-          <w:tcPr>
-            <w:tcW w:type="dxa" w:w="2880"/>
-          </w:tcPr>
-          <w:p>
-            <w:r>
-              <w:t>office space</w:t>
-            </w:r>
-          </w:p>
-        </w:tc>
-        <w:tc>
-          <w:tcPr>
-            <w:tcW w:type="dxa" w:w="2880"/>
-          </w:tcPr>
-          <w:p>
-            <w:r>
-              <w:t>₹45,508</w:t>
-            </w:r>
-          </w:p>
-        </w:tc>
-        <w:tc>
-          <w:tcPr>
-            <w:tcW w:type="dxa" w:w="2880"/>
-          </w:tcPr>
-          <w:p>
-            <w:r>
-              <w:t>2.68%</w:t>
-            </w:r>
-          </w:p>
-        </w:tc>
-      </w:tr>
-      <w:tr>
-        <w:tc>
-          <w:tcPr>
-            <w:tcW w:type="dxa" w:w="2880"/>
-          </w:tcPr>
-          <w:p>
-            <w:r>
-              <w:t>villa</w:t>
-            </w:r>
-          </w:p>
-        </w:tc>
-        <w:tc>
-          <w:tcPr>
-            <w:tcW w:type="dxa" w:w="2880"/>
-          </w:tcPr>
-          <w:p>
-            <w:r>
-              <w:t>₹51,864</w:t>
-            </w:r>
-          </w:p>
-        </w:tc>
-        <w:tc>
-          <w:tcPr>
-            <w:tcW w:type="dxa" w:w="2880"/>
-          </w:tcPr>
-          <w:p>
-            <w:r>
-              <w:t>3.63%</w:t>
-            </w:r>
-          </w:p>
-        </w:tc>
-      </w:tr>
-      <w:tr>
-        <w:tc>
-          <w:tcPr>
-            <w:tcW w:type="dxa" w:w="2880"/>
-          </w:tcPr>
-          <w:p>
-            <w:r>
-              <w:t>apartment</w:t>
-            </w:r>
-          </w:p>
-        </w:tc>
-        <w:tc>
-          <w:tcPr>
-            <w:tcW w:type="dxa" w:w="2880"/>
-          </w:tcPr>
-          <w:p>
-            <w:r>
-              <w:t>₹40,238</w:t>
-            </w:r>
-          </w:p>
-        </w:tc>
-        <w:tc>
-          <w:tcPr>
-            <w:tcW w:type="dxa" w:w="2880"/>
-          </w:tcPr>
-          <w:p>
-            <w:r>
-              <w:t>4.61%</w:t>
-            </w:r>
-          </w:p>
-        </w:tc>
-      </w:tr>
-    </w:tbl>
-    <w:p/>
-    <w:p>
-      <w:pPr>
-        <w:pStyle w:val="Heading3"/>
-      </w:pPr>
-      <w:r>
-        <w:t>Property Status Snapshot</w:t>
-      </w:r>
-    </w:p>
-    <w:p>
-      <w:r>
-        <w:t>The Property Status Snapshot for Andheri West in Mumbai's Western Suburbs shows the distribution of resale units by their readiness. The majority of units, 957, are Ready To Move with an average price of ₹31,639 per square foot. Well Occupied properties number 433 units, priced slightly higher at ₹31,857 on average. Other statuses like Under Construction and New Launch have fewer units, priced around ₹34,903 and ₹33,256 respectively, reflecting a range of options for buyers based on project completion.</w:t>
-      </w:r>
-    </w:p>
-    <w:tbl>
-      <w:tblPr>
-        <w:tblStyle w:val="TableGrid"/>
-        <w:tblW w:type="auto" w:w="0"/>
-        <w:tblLook w:firstColumn="1" w:firstRow="1" w:lastColumn="0" w:lastRow="0" w:noHBand="0" w:noVBand="1" w:val="04A0"/>
-      </w:tblPr>
-      <w:tblGrid>
-        <w:gridCol w:w="2880"/>
-        <w:gridCol w:w="2880"/>
-        <w:gridCol w:w="2880"/>
-      </w:tblGrid>
-      <w:tr>
-        <w:tc>
-          <w:tcPr>
-            <w:tcW w:type="dxa" w:w="2880"/>
-          </w:tcPr>
-          <w:p>
-            <w:r>
-              <w:t>status</w:t>
-            </w:r>
-          </w:p>
-        </w:tc>
-        <w:tc>
-          <w:tcPr>
-            <w:tcW w:type="dxa" w:w="2880"/>
-          </w:tcPr>
-          <w:p>
-            <w:r>
-              <w:t>units</w:t>
-            </w:r>
-          </w:p>
-        </w:tc>
-        <w:tc>
-          <w:tcPr>
-            <w:tcW w:type="dxa" w:w="2880"/>
-          </w:tcPr>
-          <w:p>
-            <w:r>
-              <w:t>avgPrice</w:t>
-            </w:r>
-          </w:p>
-        </w:tc>
-      </w:tr>
-      <w:tr>
-        <w:tc>
-          <w:tcPr>
-            <w:tcW w:type="dxa" w:w="2880"/>
-          </w:tcPr>
-          <w:p>
-            <w:r>
-              <w:t>Ready To Move</w:t>
-            </w:r>
-          </w:p>
-        </w:tc>
-        <w:tc>
-          <w:tcPr>
-            <w:tcW w:type="dxa" w:w="2880"/>
-          </w:tcPr>
-          <w:p>
-            <w:r>
-              <w:t>957</w:t>
-            </w:r>
-          </w:p>
-        </w:tc>
-        <w:tc>
-          <w:tcPr>
-            <w:tcW w:type="dxa" w:w="2880"/>
-          </w:tcPr>
-          <w:p>
-            <w:r>
-              <w:t>₹31,639</w:t>
-            </w:r>
-          </w:p>
-        </w:tc>
-      </w:tr>
-      <w:tr>
-        <w:tc>
-          <w:tcPr>
-            <w:tcW w:type="dxa" w:w="2880"/>
-          </w:tcPr>
-          <w:p>
-            <w:r>
-              <w:t>Well Occupied</w:t>
-            </w:r>
-          </w:p>
-        </w:tc>
-        <w:tc>
-          <w:tcPr>
-            <w:tcW w:type="dxa" w:w="2880"/>
-          </w:tcPr>
-          <w:p>
-            <w:r>
-              <w:t>433</w:t>
-            </w:r>
-          </w:p>
-        </w:tc>
-        <w:tc>
-          <w:tcPr>
-            <w:tcW w:type="dxa" w:w="2880"/>
-          </w:tcPr>
-          <w:p>
-            <w:r>
-              <w:t>₹31,857</w:t>
-            </w:r>
-          </w:p>
-        </w:tc>
-      </w:tr>
-      <w:tr>
-        <w:tc>
-          <w:tcPr>
-            <w:tcW w:type="dxa" w:w="2880"/>
-          </w:tcPr>
-          <w:p>
-            <w:r>
-              <w:t>Advanced Stage</w:t>
-            </w:r>
-          </w:p>
-        </w:tc>
-        <w:tc>
-          <w:tcPr>
-            <w:tcW w:type="dxa" w:w="2880"/>
-          </w:tcPr>
-          <w:p>
-            <w:r>
-              <w:t>2</w:t>
-            </w:r>
-          </w:p>
-        </w:tc>
-        <w:tc>
-          <w:tcPr>
-            <w:tcW w:type="dxa" w:w="2880"/>
-          </w:tcPr>
-          <w:p>
-            <w:r>
-              <w:t>₹33,739</w:t>
-            </w:r>
-          </w:p>
-        </w:tc>
-      </w:tr>
-      <w:tr>
-        <w:tc>
-          <w:tcPr>
-            <w:tcW w:type="dxa" w:w="2880"/>
-          </w:tcPr>
-          <w:p>
-            <w:r>
-              <w:t>Partially Ready To Move</w:t>
-            </w:r>
-          </w:p>
-        </w:tc>
-        <w:tc>
-          <w:tcPr>
-            <w:tcW w:type="dxa" w:w="2880"/>
-          </w:tcPr>
-          <w:p>
-            <w:r>
-              <w:t>4</w:t>
-            </w:r>
-          </w:p>
-        </w:tc>
-        <w:tc>
-          <w:tcPr>
-            <w:tcW w:type="dxa" w:w="2880"/>
-          </w:tcPr>
-          <w:p>
-            <w:r>
-              <w:t>₹44,546</w:t>
-            </w:r>
-          </w:p>
-        </w:tc>
-      </w:tr>
-      <w:tr>
-        <w:tc>
-          <w:tcPr>
-            <w:tcW w:type="dxa" w:w="2880"/>
-          </w:tcPr>
-          <w:p>
-            <w:r>
-              <w:t>Mid Stage</w:t>
-            </w:r>
-          </w:p>
-        </w:tc>
-        <w:tc>
-          <w:tcPr>
-            <w:tcW w:type="dxa" w:w="2880"/>
-          </w:tcPr>
-          <w:p>
-            <w:r>
-              <w:t>5</w:t>
-            </w:r>
-          </w:p>
-        </w:tc>
-        <w:tc>
-          <w:tcPr>
-            <w:tcW w:type="dxa" w:w="2880"/>
-          </w:tcPr>
-          <w:p>
-            <w:r>
-              <w:t>₹34,944</w:t>
-            </w:r>
-          </w:p>
-        </w:tc>
-      </w:tr>
-      <w:tr>
-        <w:tc>
-          <w:tcPr>
-            <w:tcW w:type="dxa" w:w="2880"/>
-          </w:tcPr>
-          <w:p>
-            <w:r>
-              <w:t>Under Construction</w:t>
-            </w:r>
-          </w:p>
-        </w:tc>
-        <w:tc>
-          <w:tcPr>
-            <w:tcW w:type="dxa" w:w="2880"/>
-          </w:tcPr>
-          <w:p>
-            <w:r>
-              <w:t>77</w:t>
-            </w:r>
-          </w:p>
-        </w:tc>
-        <w:tc>
-          <w:tcPr>
-            <w:tcW w:type="dxa" w:w="2880"/>
-          </w:tcPr>
-          <w:p>
-            <w:r>
-              <w:t>₹34,903</w:t>
-            </w:r>
-          </w:p>
-        </w:tc>
-      </w:tr>
-      <w:tr>
-        <w:tc>
-          <w:tcPr>
-            <w:tcW w:type="dxa" w:w="2880"/>
-          </w:tcPr>
-          <w:p>
-            <w:r>
-              <w:t>New Launch</w:t>
-            </w:r>
-          </w:p>
-        </w:tc>
-        <w:tc>
-          <w:tcPr>
-            <w:tcW w:type="dxa" w:w="2880"/>
-          </w:tcPr>
-          <w:p>
-            <w:r>
-              <w:t>25</w:t>
-            </w:r>
-          </w:p>
-        </w:tc>
-        <w:tc>
-          <w:tcPr>
-            <w:tcW w:type="dxa" w:w="2880"/>
-          </w:tcPr>
-          <w:p>
-            <w:r>
-              <w:t>₹33,256</w:t>
-            </w:r>
-          </w:p>
-        </w:tc>
-      </w:tr>
-    </w:tbl>
-    <w:p/>
-    <w:p>
-      <w:pPr>
-        <w:pStyle w:val="Heading3"/>
-      </w:pPr>
-      <w:r>
-        <w:t>Top Projects by Transactions</w:t>
-      </w:r>
-    </w:p>
-    <w:p>
-      <w:r>
-        <w:t>This table highlights the top residential projects in Andheri West, Mumbai, ranked by transaction value. K Raheja Raheja Classique leads with a current rate of ₹56,551 per sq.ft and a total sale value of ₹210 million across 5 transactions. Other notable projects include Rustomjee Elita and Oberoi Springs, with rates of ₹50,083 and ₹45,604 respectively, each recording 3 transactions. These figures provide a clear snapshot of active resale market values in this prominent Mumbai Western Suburbs locality.</w:t>
-      </w:r>
-    </w:p>
-    <w:tbl>
-      <w:tblPr>
-        <w:tblStyle w:val="TableGrid"/>
-        <w:tblW w:type="auto" w:w="0"/>
-        <w:tblLook w:firstColumn="1" w:firstRow="1" w:lastColumn="0" w:lastRow="0" w:noHBand="0" w:noVBand="1" w:val="04A0"/>
-      </w:tblPr>
-      <w:tblGrid>
-        <w:gridCol w:w="1728"/>
-        <w:gridCol w:w="1728"/>
-        <w:gridCol w:w="1728"/>
-        <w:gridCol w:w="1728"/>
-        <w:gridCol w:w="1728"/>
-      </w:tblGrid>
-      <w:tr>
-        <w:tc>
-          <w:tcPr>
-            <w:tcW w:type="dxa" w:w="1728"/>
-          </w:tcPr>
-          <w:p>
-            <w:r>
-              <w:t>projectName</w:t>
-            </w:r>
-          </w:p>
-        </w:tc>
-        <w:tc>
-          <w:tcPr>
-            <w:tcW w:type="dxa" w:w="1728"/>
-          </w:tcPr>
-          <w:p>
-            <w:r>
-              <w:t>currentRate</w:t>
-            </w:r>
-          </w:p>
-        </w:tc>
-        <w:tc>
-          <w:tcPr>
-            <w:tcW w:type="dxa" w:w="1728"/>
-          </w:tcPr>
-          <w:p>
-            <w:r>
-              <w:t>saleRentValue</w:t>
-            </w:r>
-          </w:p>
-        </w:tc>
-        <w:tc>
-          <w:tcPr>
-            <w:tcW w:type="dxa" w:w="1728"/>
-          </w:tcPr>
-          <w:p>
-            <w:r>
-              <w:t>noOfTransactions</w:t>
-            </w:r>
-          </w:p>
-        </w:tc>
-        <w:tc>
-          <w:tcPr>
-            <w:tcW w:type="dxa" w:w="1728"/>
-          </w:tcPr>
-          <w:p>
-            <w:r>
-              <w:t>productUrl</w:t>
-            </w:r>
-          </w:p>
-        </w:tc>
-      </w:tr>
-      <w:tr>
-        <w:tc>
-          <w:tcPr>
-            <w:tcW w:type="dxa" w:w="1728"/>
-          </w:tcPr>
-          <w:p>
-            <w:r>
-              <w:t>K Raheja Raheja Classique</w:t>
-            </w:r>
-          </w:p>
-        </w:tc>
-        <w:tc>
-          <w:tcPr>
-            <w:tcW w:type="dxa" w:w="1728"/>
-          </w:tcPr>
-          <w:p>
-            <w:r>
-              <w:t>₹56,551</w:t>
-            </w:r>
-          </w:p>
-        </w:tc>
-        <w:tc>
-          <w:tcPr>
-            <w:tcW w:type="dxa" w:w="1728"/>
-          </w:tcPr>
-          <w:p>
-            <w:r>
-              <w:t>₹210,000,000</w:t>
-            </w:r>
-          </w:p>
-        </w:tc>
-        <w:tc>
-          <w:tcPr>
-            <w:tcW w:type="dxa" w:w="1728"/>
-          </w:tcPr>
-          <w:p>
-            <w:r>
-              <w:t>5</w:t>
-            </w:r>
-          </w:p>
-        </w:tc>
-        <w:tc>
-          <w:tcPr>
-            <w:tcW w:type="dxa" w:w="1728"/>
-          </w:tcPr>
-          <w:p>
-            <w:r>
-              <w:t>https://www.squareyards.com/property-rates/k-raheja-raheja-classique-shashtri-nagar-andheri-west-mumbai</w:t>
-            </w:r>
-          </w:p>
-        </w:tc>
-      </w:tr>
-      <w:tr>
-        <w:tc>
-          <w:tcPr>
-            <w:tcW w:type="dxa" w:w="1728"/>
-          </w:tcPr>
-          <w:p>
-            <w:r>
-              <w:t>Rustomjee Elita</w:t>
-            </w:r>
-          </w:p>
-        </w:tc>
-        <w:tc>
-          <w:tcPr>
-            <w:tcW w:type="dxa" w:w="1728"/>
-          </w:tcPr>
-          <w:p>
-            <w:r>
-              <w:t>₹50,083</w:t>
-            </w:r>
-          </w:p>
-        </w:tc>
-        <w:tc>
-          <w:tcPr>
-            <w:tcW w:type="dxa" w:w="1728"/>
-          </w:tcPr>
-          <w:p>
-            <w:r>
-              <w:t>₹158,900,000</w:t>
-            </w:r>
-          </w:p>
-        </w:tc>
-        <w:tc>
-          <w:tcPr>
-            <w:tcW w:type="dxa" w:w="1728"/>
-          </w:tcPr>
-          <w:p>
-            <w:r>
-              <w:t>3</w:t>
-            </w:r>
-          </w:p>
-        </w:tc>
-        <w:tc>
-          <w:tcPr>
-            <w:tcW w:type="dxa" w:w="1728"/>
-          </w:tcPr>
-          <w:p>
-            <w:r>
-              <w:t>https://www.squareyards.com/property-rates/rustomjee-elita-four-bunglows-andheri-west-mumbai</w:t>
-            </w:r>
-          </w:p>
-        </w:tc>
-      </w:tr>
-      <w:tr>
-        <w:tc>
-          <w:tcPr>
-            <w:tcW w:type="dxa" w:w="1728"/>
-          </w:tcPr>
-          <w:p>
-            <w:r>
-              <w:t>Oberoi Springs</w:t>
-            </w:r>
-          </w:p>
-        </w:tc>
-        <w:tc>
-          <w:tcPr>
-            <w:tcW w:type="dxa" w:w="1728"/>
-          </w:tcPr>
-          <w:p>
-            <w:r>
-              <w:t>₹45,604</w:t>
-            </w:r>
-          </w:p>
-        </w:tc>
-        <w:tc>
-          <w:tcPr>
-            <w:tcW w:type="dxa" w:w="1728"/>
-          </w:tcPr>
-          <w:p>
-            <w:r>
-              <w:t>₹129,100,000</w:t>
-            </w:r>
-          </w:p>
-        </w:tc>
-        <w:tc>
-          <w:tcPr>
-            <w:tcW w:type="dxa" w:w="1728"/>
-          </w:tcPr>
-          <w:p>
-            <w:r>
-              <w:t>3</w:t>
-            </w:r>
-          </w:p>
-        </w:tc>
-        <w:tc>
-          <w:tcPr>
-            <w:tcW w:type="dxa" w:w="1728"/>
-          </w:tcPr>
-          <w:p>
-            <w:r>
-              <w:t>https://www.squareyards.com/property-rates/oberoi-springs-veera-desai-industrial-estate-andheri-west-mumbai</w:t>
-            </w:r>
-          </w:p>
-        </w:tc>
-      </w:tr>
-      <w:tr>
-        <w:tc>
-          <w:tcPr>
-            <w:tcW w:type="dxa" w:w="1728"/>
-          </w:tcPr>
-          <w:p>
-            <w:r>
-              <w:t>Platinum Life</w:t>
-            </w:r>
-          </w:p>
-        </w:tc>
-        <w:tc>
-          <w:tcPr>
-            <w:tcW w:type="dxa" w:w="1728"/>
-          </w:tcPr>
-          <w:p>
-            <w:r>
-              <w:t>₹43,780</w:t>
-            </w:r>
-          </w:p>
-        </w:tc>
-        <w:tc>
-          <w:tcPr>
-            <w:tcW w:type="dxa" w:w="1728"/>
-          </w:tcPr>
-          <w:p>
-            <w:r>
-              <w:t>₹80,650,000</w:t>
-            </w:r>
-          </w:p>
-        </w:tc>
-        <w:tc>
-          <w:tcPr>
-            <w:tcW w:type="dxa" w:w="1728"/>
-          </w:tcPr>
-          <w:p>
-            <w:r>
-              <w:t>3</w:t>
-            </w:r>
-          </w:p>
-        </w:tc>
-        <w:tc>
-          <w:tcPr>
-            <w:tcW w:type="dxa" w:w="1728"/>
-          </w:tcPr>
-          <w:p>
-            <w:r>
-              <w:t>https://www.squareyards.com/property-rates/platinum-life-dn-nagar-andheri-west-mumbai</w:t>
-            </w:r>
-          </w:p>
-        </w:tc>
-      </w:tr>
-      <w:tr>
-        <w:tc>
-          <w:tcPr>
-            <w:tcW w:type="dxa" w:w="1728"/>
-          </w:tcPr>
-          <w:p>
-            <w:r>
-              <w:t xml:space="preserve">Mayfair Gardens </w:t>
-            </w:r>
-          </w:p>
-        </w:tc>
-        <w:tc>
-          <w:tcPr>
-            <w:tcW w:type="dxa" w:w="1728"/>
-          </w:tcPr>
-          <w:p>
-            <w:r>
-              <w:t>₹41,097</w:t>
-            </w:r>
-          </w:p>
-        </w:tc>
-        <w:tc>
-          <w:tcPr>
-            <w:tcW w:type="dxa" w:w="1728"/>
-          </w:tcPr>
-          <w:p>
-            <w:r>
-              <w:t>₹66,600,000</w:t>
-            </w:r>
-          </w:p>
-        </w:tc>
-        <w:tc>
-          <w:tcPr>
-            <w:tcW w:type="dxa" w:w="1728"/>
-          </w:tcPr>
-          <w:p>
-            <w:r>
-              <w:t>3</w:t>
-            </w:r>
-          </w:p>
-        </w:tc>
-        <w:tc>
-          <w:tcPr>
-            <w:tcW w:type="dxa" w:w="1728"/>
-          </w:tcPr>
-          <w:p>
-            <w:r>
-              <w:t>https://www.squareyards.com/property-rates/mayfair-gardens-azad-nagar-andheri-west-mumbai</w:t>
-            </w:r>
-          </w:p>
-        </w:tc>
-      </w:tr>
-      <w:tr>
-        <w:tc>
-          <w:tcPr>
-            <w:tcW w:type="dxa" w:w="1728"/>
-          </w:tcPr>
-          <w:p>
-            <w:r>
-              <w:t>Kaveri Tower Andheri West</w:t>
-            </w:r>
-          </w:p>
-        </w:tc>
-        <w:tc>
-          <w:tcPr>
-            <w:tcW w:type="dxa" w:w="1728"/>
-          </w:tcPr>
-          <w:p>
-            <w:r>
-              <w:t>₹37,000</w:t>
-            </w:r>
-          </w:p>
-        </w:tc>
-        <w:tc>
-          <w:tcPr>
-            <w:tcW w:type="dxa" w:w="1728"/>
-          </w:tcPr>
-          <w:p>
-            <w:r>
-              <w:t>₹50,800,000</w:t>
-            </w:r>
-          </w:p>
-        </w:tc>
-        <w:tc>
-          <w:tcPr>
-            <w:tcW w:type="dxa" w:w="1728"/>
-          </w:tcPr>
-          <w:p>
-            <w:r>
-              <w:t>3</w:t>
-            </w:r>
-          </w:p>
-        </w:tc>
-        <w:tc>
-          <w:tcPr>
-            <w:tcW w:type="dxa" w:w="1728"/>
-          </w:tcPr>
-          <w:p>
-            <w:r>
-              <w:t>https://www.squareyards.com/property-rates/kaveri-tower-andheri-west-industrial-area-andheri-west-mumbai</w:t>
-            </w:r>
-          </w:p>
-        </w:tc>
-      </w:tr>
-      <w:tr>
-        <w:tc>
-          <w:tcPr>
-            <w:tcW w:type="dxa" w:w="1728"/>
-          </w:tcPr>
-          <w:p>
-            <w:r>
-              <w:t>DLH Metroview</w:t>
-            </w:r>
-          </w:p>
-        </w:tc>
-        <w:tc>
-          <w:tcPr>
-            <w:tcW w:type="dxa" w:w="1728"/>
-          </w:tcPr>
-          <w:p>
-            <w:r>
-              <w:t>₹35,229</w:t>
-            </w:r>
-          </w:p>
-        </w:tc>
-        <w:tc>
-          <w:tcPr>
-            <w:tcW w:type="dxa" w:w="1728"/>
-          </w:tcPr>
-          <w:p>
-            <w:r>
-              <w:t>₹52,500,000</w:t>
-            </w:r>
-          </w:p>
-        </w:tc>
-        <w:tc>
-          <w:tcPr>
-            <w:tcW w:type="dxa" w:w="1728"/>
-          </w:tcPr>
-          <w:p>
-            <w:r>
-              <w:t>3</w:t>
-            </w:r>
-          </w:p>
-        </w:tc>
-        <w:tc>
-          <w:tcPr>
-            <w:tcW w:type="dxa" w:w="1728"/>
-          </w:tcPr>
-          <w:p>
-            <w:r>
-              <w:t>https://www.squareyards.com/property-rates/dlh-metroview-dn-nagar-andheri-west-mumbai</w:t>
-            </w:r>
-          </w:p>
-        </w:tc>
-      </w:tr>
-      <w:tr>
-        <w:tc>
-          <w:tcPr>
-            <w:tcW w:type="dxa" w:w="1728"/>
-          </w:tcPr>
-          <w:p>
-            <w:r>
-              <w:t>Evershine Embassy</w:t>
-            </w:r>
-          </w:p>
-        </w:tc>
-        <w:tc>
-          <w:tcPr>
-            <w:tcW w:type="dxa" w:w="1728"/>
-          </w:tcPr>
-          <w:p>
-            <w:r>
-              <w:t>₹31,778</w:t>
-            </w:r>
-          </w:p>
-        </w:tc>
-        <w:tc>
-          <w:tcPr>
-            <w:tcW w:type="dxa" w:w="1728"/>
-          </w:tcPr>
-          <w:p>
-            <w:r>
-              <w:t>₹71,600,000</w:t>
-            </w:r>
-          </w:p>
-        </w:tc>
-        <w:tc>
-          <w:tcPr>
-            <w:tcW w:type="dxa" w:w="1728"/>
-          </w:tcPr>
-          <w:p>
-            <w:r>
-              <w:t>3</w:t>
-            </w:r>
-          </w:p>
-        </w:tc>
-        <w:tc>
-          <w:tcPr>
-            <w:tcW w:type="dxa" w:w="1728"/>
-          </w:tcPr>
-          <w:p>
-            <w:r>
-              <w:t>https://www.squareyards.com/property-rates/evershine-embassy-shashtri-nagar-andheri-west-mumbai</w:t>
-            </w:r>
-          </w:p>
-        </w:tc>
-      </w:tr>
-      <w:tr>
-        <w:tc>
-          <w:tcPr>
-            <w:tcW w:type="dxa" w:w="1728"/>
-          </w:tcPr>
-          <w:p>
-            <w:r>
-              <w:t>Shree Ashtavinayak CHS Andheri</w:t>
-            </w:r>
-          </w:p>
-        </w:tc>
-        <w:tc>
-          <w:tcPr>
-            <w:tcW w:type="dxa" w:w="1728"/>
-          </w:tcPr>
-          <w:p>
-            <w:r>
-              <w:t>₹29,081</w:t>
-            </w:r>
-          </w:p>
-        </w:tc>
-        <w:tc>
-          <w:tcPr>
-            <w:tcW w:type="dxa" w:w="1728"/>
-          </w:tcPr>
-          <w:p>
-            <w:r>
-              <w:t>₹48,200,000</w:t>
-            </w:r>
-          </w:p>
-        </w:tc>
-        <w:tc>
-          <w:tcPr>
-            <w:tcW w:type="dxa" w:w="1728"/>
-          </w:tcPr>
-          <w:p>
-            <w:r>
-              <w:t>3</w:t>
-            </w:r>
-          </w:p>
-        </w:tc>
-        <w:tc>
-          <w:tcPr>
-            <w:tcW w:type="dxa" w:w="1728"/>
-          </w:tcPr>
-          <w:p>
-            <w:r>
-              <w:t>https://www.squareyards.com/property-rates/shree-ashtavinayak-chs-andheri-dn-nagar-andheri-west-mumbai</w:t>
-            </w:r>
-          </w:p>
-        </w:tc>
-      </w:tr>
-      <w:tr>
-        <w:tc>
-          <w:tcPr>
-            <w:tcW w:type="dxa" w:w="1728"/>
-          </w:tcPr>
-          <w:p>
-            <w:r>
-              <w:t>Mayfair Meridian</w:t>
-            </w:r>
-          </w:p>
-        </w:tc>
-        <w:tc>
-          <w:tcPr>
-            <w:tcW w:type="dxa" w:w="1728"/>
-          </w:tcPr>
-          <w:p>
-            <w:r>
-              <w:t>₹27,606</w:t>
-            </w:r>
-          </w:p>
-        </w:tc>
-        <w:tc>
-          <w:tcPr>
-            <w:tcW w:type="dxa" w:w="1728"/>
-          </w:tcPr>
-          <w:p>
-            <w:r>
-              <w:t>₹68,100,000</w:t>
-            </w:r>
-          </w:p>
-        </w:tc>
-        <w:tc>
-          <w:tcPr>
-            <w:tcW w:type="dxa" w:w="1728"/>
-          </w:tcPr>
-          <w:p>
-            <w:r>
-              <w:t>3</w:t>
-            </w:r>
-          </w:p>
-        </w:tc>
-        <w:tc>
-          <w:tcPr>
-            <w:tcW w:type="dxa" w:w="1728"/>
-          </w:tcPr>
-          <w:p>
-            <w:r>
-              <w:t>https://www.squareyards.com/property-rates/mayfair-meridian-amboli-andheri-west-mumbai</w:t>
-            </w:r>
-          </w:p>
-        </w:tc>
-      </w:tr>
-    </w:tbl>
-    <w:p/>
-    <w:p>
-      <w:pPr>
-        <w:pStyle w:val="Heading2"/>
-      </w:pPr>
-      <w:r>
-        <w:t>Frequently Asked Questions</w:t>
-      </w:r>
-    </w:p>
-    <w:p>
-      <w:pPr>
-        <w:pStyle w:val="Heading3"/>
-      </w:pPr>
-      <w:r>
-        <w:t>What is the asking price signal for resale properties in Andheri West, Mumbai?</w:t>
-      </w:r>
-    </w:p>
-    <w:p>
-      <w:r>
-        <w:t>The grounded asking price signal for resale properties in Andheri West, Mumbai is ₹40,238. In the available trend inputs, the latest tracked quarter is Dec 2025, the locality-level rate in that entry is ₹40,238, the micromarket-level rate is ₹21,180. This answer stays limited to the asking-price and price-trend fields available in the current structured dataset.</w:t>
-      </w:r>
-    </w:p>
-    <w:p>
-      <w:pPr>
-        <w:pStyle w:val="Heading3"/>
-      </w:pPr>
-      <w:r>
-        <w:t>How many resale properties are available in Andheri West, Mumbai?</w:t>
-      </w:r>
-    </w:p>
-    <w:p>
-      <w:r>
-        <w:t>Currently, there are about 2,039 resale properties available in Andheri West. These listings include a variety of unit types and price points, with a total of 6,109 properties listed for sale and rent combined. The resale market here is active, offering buyers a broad selection across different configurations.</w:t>
-      </w:r>
-    </w:p>
-    <w:p>
-      <w:pPr>
-        <w:pStyle w:val="Heading3"/>
-      </w:pPr>
-      <w:r>
-        <w:t>Which BHK options are commonly available in Andheri West, Mumbai?</w:t>
-      </w:r>
-    </w:p>
-    <w:p>
-      <w:r>
-        <w:t>In Andheri West, the most common resale property configurations include 3 BHK units with 789 listings, followed by 2 BHK flats with 579 listings. Other available options include 4 BHK (188 listings), 1 BHK (141 listings), and some larger units like 5 BHK and 6 BHK. This variety caters to diverse buyer preferences and family sizes.</w:t>
-      </w:r>
-    </w:p>
-    <w:p>
-      <w:pPr>
-        <w:pStyle w:val="Heading3"/>
-      </w:pPr>
-      <w:r>
-        <w:t>Are ready-to-move resale properties available in Andheri West, Mumbai?</w:t>
-      </w:r>
-    </w:p>
-    <w:p>
-      <w:r>
-        <w:t>Yes, Andheri West has a significant inventory of ready-to-move resale properties, with 957 units currently available. These properties have an average price of around ₹31,639 per sq ft. The ready-to-move segment dominates the resale market, offering immediate occupancy options for buyers.</w:t>
-      </w:r>
-    </w:p>
-    <w:p>
-      <w:pPr>
-        <w:pStyle w:val="Heading3"/>
-      </w:pPr>
-      <w:r>
-        <w:t>Which nearby localities can buyers also consider around Andheri West, Mumbai?</w:t>
-      </w:r>
-    </w:p>
-    <w:p>
-      <w:r>
-        <w:t>Buyers looking near Andheri West can consider localities such as Mudran Press Colony, Suresh Nagar, Bhudargarh Colony, SV Patel Nagar, and Shashtri Nagar. These areas are within about 1 km distance and offer resale properties with varying price points, providing additional options for buyers seeking proximity to Andheri West.</w:t>
-      </w:r>
-    </w:p>
-    <w:p>
-      <w:pPr>
-        <w:pStyle w:val="Heading3"/>
-      </w:pPr>
-      <w:r>
-        <w:t>What review and rating signals are available for Andheri West, Mumbai?</w:t>
-      </w:r>
-    </w:p>
-    <w:p>
-      <w:r>
-        <w:t>Andheri West has an average rating of 4.24 out of 5 based on 97 reviews. The majority of ratings are positive, with 40 five-star and 43 four-star reviews. This reflects generally favorable feedback from residents and buyers regarding the locality.</w:t>
-      </w:r>
-    </w:p>
-    <w:p>
-      <w:pPr>
-        <w:pStyle w:val="Heading3"/>
-      </w:pPr>
-      <w:r>
-        <w:t>What demand and supply signals are available for resale listings in Andheri West, Mumbai?</w:t>
-      </w:r>
-    </w:p>
-    <w:p>
-      <w:r>
-        <w:t>In resale listings, 2 BHK flats represent about 32% of supply and 30% of demand, while 3 BHK units make up 43% of supply but only 19% of demand, indicating a higher supply relative to demand for larger units. Apartments dominate the market with 82% supply and 81% demand. Price-wise, most listings fall between ₹2 Cr and ₹5 Cr, accounting for 54% of supply and 43% of demand.</w:t>
-      </w:r>
-    </w:p>
-    <w:p>
-      <w:pPr>
-        <w:pStyle w:val="Heading3"/>
-      </w:pPr>
-      <w:r>
-        <w:t>What property-type signals are visible for resale listings in Andheri West, Mumbai?</w:t>
-      </w:r>
-    </w:p>
-    <w:p>
-      <w:r>
-        <w:t>For Andheri West, Mumbai, the grounded property-type layer shows shop in the visible property-type rate inputs, average listed value of ₹78,643, change percent of -6.11, Apartment with a document count of 1658 in the visible property-type mix. These fields help explain how the current resale stock is distributed across available property formats without ranking one type over another.</w:t>
-      </w:r>
-    </w:p>
-    <w:p>
-      <w:pPr>
-        <w:pStyle w:val="Heading3"/>
-      </w:pPr>
-      <w:r>
-        <w:t>What price range is visible for resale listings in Andheri West, Mumbai?</w:t>
-      </w:r>
-    </w:p>
-    <w:p>
-      <w:r>
-        <w:t>For Andheri West, Mumbai, the grounded listing-range inputs show that the visible resale price-range dataset covers 1933 listings, the minimum listed price is ₹2,320,000, the maximum listed price is ₹4,900,000,000. This answer is based only on the structured price-range values available in the current resale dataset.</w:t>
-      </w:r>
-    </w:p>
-    <w:p>
-      <w:pPr>
-        <w:pStyle w:val="Heading3"/>
-      </w:pPr>
-      <w:r>
-        <w:t>What market strengths, challenges, and opportunities are highlighted for Andheri West, Mumbai?</w:t>
-      </w:r>
-    </w:p>
-    <w:p>
-      <w:r>
-        <w:t>For Andheri West, Mumbai, the structured market-summary layer includes a snapshot that reads: The Andheri West real estate market in Mumbai is currently dynamic, with asking prices averaging ₹40,238 per sq ft. Recent quarterly trends reveal a notable appreciation, particularly from June to December 2025, signaling strong market confidence. The area has seen substantial transaction activity, with 2,920 registered deals totaling a gross value of ₹7,241 Cr over the past year. This vibrant market caters to diverse preferences, offering a mix of apartments, villas, and commercial spaces, with significant demand for Ready To Move properties, and is actively shaped by leading developers like Chandiwala Enterprises and Platinum Corp. It also highlights strengths such as Andheri West maintains a strong overall market sentiment with an average asking price of ₹40,238 per sq ft and positive quarterly price trends., The significant volume of 2,920 registered transactions and a gross value of ₹7,241 Cr highlights a and active real estate market., The dominance of Ready To Move properties (957 units) caters to immediate occupancy needs, driving consistent buyer interest., challenges such as The commercial shop segment in Andheri West has experienced a 6.11% price decline, despite commanding the highest per sq ft rate, suggesting potential oversupply or shifting demand., Advanced Stage projects have seen a significant 12.06% price decrease, indicating possible challenges in offloading properties close to completion or pricing adjustments., The absence of average rental rate data makes it difficult for potential investors to accurately assess rental yield and passive income opportunities., opportunity cues such as Investing in apartments in Andheri West, which show a healthy 4.61% price increase and an average rate of ₹40,238 per sq ft, presents a stable growth opportunity., Considering localities like Vile Parle West, which recorded a substantial 7.75% price appreciation, for higher capital gains., Exploring Under Construction projects, currently averaging ₹34,903 per sq ft with a slight positive trend, at competitive prices before completion.. These signals are presented as grounded market-summary notes only, so they should be read as descriptive inputs rather than promotional promises.</w:t>
-      </w:r>
-    </w:p>
-    <w:p>
-      <w:pPr>
-        <w:pStyle w:val="Heading2"/>
-      </w:pPr>
-      <w:r>
-        <w:t>Internal Links</w:t>
-      </w:r>
-    </w:p>
-    <w:p>
-      <w:pPr>
-        <w:pStyle w:val="Heading3"/>
-      </w:pPr>
-      <w:r>
-        <w:t>Unit Type Links</w:t>
-      </w:r>
-    </w:p>
-    <w:p>
-      <w:pPr>
-        <w:pStyle w:val="ListBullet"/>
-      </w:pPr>
-      <w:r>
-        <w:t>1 BHK: https://www.squareyards.com/sale/1-bhk-for-sale-in-andheri-west-mumbai</w:t>
-      </w:r>
-    </w:p>
-    <w:p>
-      <w:pPr>
-        <w:pStyle w:val="ListBullet"/>
-      </w:pPr>
-      <w:r>
-        <w:t>1 RK: https://www.squareyards.com/sale/1-rk-for-sale-in-andheri-west-mumbai</w:t>
-      </w:r>
-    </w:p>
-    <w:p>
-      <w:pPr>
-        <w:pStyle w:val="ListBullet"/>
-      </w:pPr>
-      <w:r>
-        <w:t>2 BHK: https://www.squareyards.com/sale/2-bhk-for-sale-in-andheri-west-mumbai</w:t>
-      </w:r>
-    </w:p>
-    <w:p>
-      <w:pPr>
-        <w:pStyle w:val="ListBullet"/>
-      </w:pPr>
-      <w:r>
-        <w:t>3 BHK: https://www.squareyards.com/sale/3-bhk-for-sale-in-andheri-west-mumbai</w:t>
-      </w:r>
-    </w:p>
-    <w:p>
-      <w:pPr>
-        <w:pStyle w:val="ListBullet"/>
-      </w:pPr>
-      <w:r>
-        <w:t>4 BHK: https://www.squareyards.com/sale/4-bhk-for-sale-in-andheri-west-mumbai</w:t>
-      </w:r>
-    </w:p>
-    <w:p>
-      <w:pPr>
-        <w:pStyle w:val="ListBullet"/>
-      </w:pPr>
-      <w:r>
-        <w:t>5 BHK: https://www.squareyards.com/sale/5-bhk-for-sale-in-andheri-west-mumbai</w:t>
-      </w:r>
-    </w:p>
-    <w:p>
-      <w:pPr>
-        <w:pStyle w:val="ListBullet"/>
-      </w:pPr>
-      <w:r>
-        <w:t>6 BHK: https://www.squareyards.com/sale/6-bhk-for-sale-in-andheri-west-mumbai</w:t>
-      </w:r>
-    </w:p>
-    <w:p>
-      <w:pPr>
-        <w:pStyle w:val="ListBullet"/>
-      </w:pPr>
-      <w:r>
-        <w:t>Studio: https://www.squareyards.com/sale/studio-for-sale-in-andheri-west-mumbai</w:t>
-      </w:r>
-    </w:p>
-    <w:p>
-      <w:pPr>
-        <w:pStyle w:val="Heading3"/>
-      </w:pPr>
-      <w:r>
-        <w:t>Property Type Links</w:t>
-      </w:r>
-    </w:p>
-    <w:p>
-      <w:pPr>
-        <w:pStyle w:val="ListBullet"/>
-      </w:pPr>
-      <w:r>
-        <w:t>Apartment: https://www.squareyards.com/sale/apartments-for-sale-in-andheri-west-mumbai</w:t>
-      </w:r>
-    </w:p>
-    <w:p>
-      <w:pPr>
-        <w:pStyle w:val="ListBullet"/>
-      </w:pPr>
-      <w:r>
-        <w:t>Builder Floor: https://www.squareyards.com/sale/builder-floors-for-sale-in-andheri-west-mumbai</w:t>
-      </w:r>
-    </w:p>
-    <w:p>
-      <w:pPr>
-        <w:pStyle w:val="ListBullet"/>
-      </w:pPr>
-      <w:r>
-        <w:t>Independent House: https://www.squareyards.com/sale/independent-houses-for-sale-in-andheri-west-mumbai</w:t>
-      </w:r>
-    </w:p>
-    <w:p>
-      <w:pPr>
-        <w:pStyle w:val="ListBullet"/>
-      </w:pPr>
-      <w:r>
-        <w:t>Office Space: https://www.squareyards.com/sale/office-spaces-for-sale-in-andheri-west-mumbai</w:t>
-      </w:r>
-    </w:p>
-    <w:p>
-      <w:pPr>
-        <w:pStyle w:val="ListBullet"/>
-      </w:pPr>
-      <w:r>
-        <w:t>Penthouse: https://www.squareyards.com/sale/penthouses-for-sale-in-andheri-west-mumbai</w:t>
-      </w:r>
-    </w:p>
-    <w:p>
-      <w:pPr>
-        <w:pStyle w:val="ListBullet"/>
-      </w:pPr>
-      <w:r>
-        <w:t>Plot: https://www.squareyards.com/sale/plots-for-sale-in-andheri-west-mumbai</w:t>
-      </w:r>
-    </w:p>
-    <w:p>
-      <w:pPr>
-        <w:pStyle w:val="ListBullet"/>
-      </w:pPr>
-      <w:r>
-        <w:t>Shop: https://www.squareyards.com/sale/shops-for-sale-in-andheri-west-mumbai</w:t>
-      </w:r>
-    </w:p>
-    <w:p>
-      <w:pPr>
-        <w:pStyle w:val="ListBullet"/>
-      </w:pPr>
-      <w:r>
-        <w:t>Showroom: https://www.squareyards.com/sale/showrooms-for-sale-in-andheri-west-mumbai</w:t>
-      </w:r>
-    </w:p>
-    <w:p>
-      <w:pPr>
-        <w:pStyle w:val="ListBullet"/>
-      </w:pPr>
-      <w:r>
-        <w:t>Villa: https://www.squareyards.com/sale/villas-for-sale-in-andheri-west-mumbai</w:t>
-      </w:r>
-    </w:p>
-    <w:p>
-      <w:pPr>
-        <w:pStyle w:val="Heading3"/>
-      </w:pPr>
-      <w:r>
-        <w:t>Quick Links</w:t>
-      </w:r>
-    </w:p>
-    <w:p>
-      <w:pPr>
-        <w:pStyle w:val="ListBullet"/>
-      </w:pPr>
-      <w:r>
-        <w:t>New Projects in Andheri West: https://www.squareyards.com/projects-in-andheri-west-mumbai</w:t>
-      </w:r>
-    </w:p>
-    <w:p>
-      <w:pPr>
-        <w:pStyle w:val="ListBullet"/>
-      </w:pPr>
-      <w:r>
-        <w:t>New Launch Projects in Andheri West: https://www.squareyards.com/new-launch-projects-in-andheri-west-mumbai</w:t>
-      </w:r>
-    </w:p>
-    <w:p>
-      <w:pPr>
-        <w:pStyle w:val="ListBullet"/>
-      </w:pPr>
-      <w:r>
-        <w:t>Ready to Move Projects in Andheri West: https://www.squareyards.com/ready-to-move-projects-in-andheri-west-mumbai</w:t>
-      </w:r>
-    </w:p>
-    <w:p>
-      <w:pPr>
-        <w:pStyle w:val="ListBullet"/>
-      </w:pPr>
-      <w:r>
-        <w:t>Under Construction Projects in Andheri West: https://www.squareyards.com/under-construction-projects-in-andheri-west-mumbai</w:t>
-      </w:r>
-    </w:p>
-    <w:p>
-      <w:pPr>
-        <w:pStyle w:val="Heading3"/>
-      </w:pPr>
-      <w:r>
-        <w:t>Nearby Locality Links</w:t>
-      </w:r>
-    </w:p>
-    <w:p>
-      <w:pPr>
-        <w:pStyle w:val="ListBullet"/>
-      </w:pPr>
-      <w:r>
-        <w:t>Mudran Press Colony: https://www.squareyards.com/mudran-press-colony-mumbai</w:t>
-      </w:r>
-    </w:p>
-    <w:p>
-      <w:pPr>
-        <w:pStyle w:val="ListBullet"/>
-      </w:pPr>
-      <w:r>
-        <w:t>Suresh Nagar: https://www.squareyards.com/suresh-nagar-mumbai</w:t>
-      </w:r>
-    </w:p>
-    <w:p>
-      <w:pPr>
-        <w:pStyle w:val="ListBullet"/>
-      </w:pPr>
-      <w:r>
-        <w:t>Bhudargarh Colony: https://www.squareyards.com/bhudargarh-colony-mumbai</w:t>
-      </w:r>
-    </w:p>
-    <w:p>
-      <w:pPr>
-        <w:pStyle w:val="ListBullet"/>
-      </w:pPr>
-      <w:r>
-        <w:t>Laxmi Industrial Estate: https://www.squareyards.com/laxmi-industrial-estate-mumbai</w:t>
-      </w:r>
-    </w:p>
-    <w:p>
-      <w:pPr>
-        <w:pStyle w:val="ListBullet"/>
-      </w:pPr>
-      <w:r>
-        <w:t>Sv Patel Nagar: https://www.squareyards.com/sv-patel-nagar-mumbai</w:t>
-      </w:r>
-    </w:p>
-    <w:p>
-      <w:pPr>
-        <w:pStyle w:val="ListBullet"/>
-      </w:pPr>
-      <w:r>
-        <w:t>Manish Nagar: https://www.squareyards.com/manish-nagar-mumbai</w:t>
-      </w:r>
-    </w:p>
-    <w:p>
-      <w:pPr>
-        <w:pStyle w:val="ListBullet"/>
-      </w:pPr>
-      <w:r>
-        <w:t>Shashtri Nagar: https://www.squareyards.com/shashtri-nagar-mumbai</w:t>
-      </w:r>
-    </w:p>
-    <w:p>
-      <w:pPr>
-        <w:pStyle w:val="ListBullet"/>
-      </w:pPr>
-      <w:r>
-        <w:t>Seven Bunglow: https://www.squareyards.com/seven-bunglow-mumbai</w:t>
-      </w:r>
-    </w:p>
-    <w:p>
-      <w:pPr>
-        <w:pStyle w:val="ListBullet"/>
-      </w:pPr>
-      <w:r>
-        <w:t>Jeevan Nagar: https://www.squareyards.com/jeevan-nagar-mumbai</w:t>
-      </w:r>
-    </w:p>
-    <w:p>
-      <w:pPr>
-        <w:pStyle w:val="ListBullet"/>
-      </w:pPr>
-      <w:r>
-        <w:t>Industrial Area: https://www.squareyards.com/industrial-area-mumbai</w:t>
-      </w:r>
-    </w:p>
-    <w:p>
-      <w:pPr>
-        <w:pStyle w:val="Heading3"/>
-      </w:pPr>
-      <w:r>
-        <w:t>Top Project Links</w:t>
-      </w:r>
-    </w:p>
-    <w:p>
-      <w:pPr>
-        <w:pStyle w:val="ListBullet"/>
-      </w:pPr>
-      <w:r>
-        <w:t>K Raheja Raheja Classique: https://www.squareyards.com/property-rates/k-raheja-raheja-classique-shashtri-nagar-andheri-west-mumbai</w:t>
-      </w:r>
-    </w:p>
-    <w:p>
-      <w:pPr>
-        <w:pStyle w:val="ListBullet"/>
-      </w:pPr>
-      <w:r>
-        <w:t>Rustomjee Elita: https://www.squareyards.com/property-rates/rustomjee-elita-four-bunglows-andheri-west-mumbai</w:t>
-      </w:r>
-    </w:p>
-    <w:p>
-      <w:pPr>
-        <w:pStyle w:val="ListBullet"/>
-      </w:pPr>
-      <w:r>
-        <w:t>Oberoi Springs: https://www.squareyards.com/property-rates/oberoi-springs-veera-desai-industrial-estate-andheri-west-mumbai</w:t>
-      </w:r>
-    </w:p>
-    <w:p>
-      <w:pPr>
-        <w:pStyle w:val="ListBullet"/>
-      </w:pPr>
-      <w:r>
-        <w:t>Platinum Life: https://www.squareyards.com/property-rates/platinum-life-dn-nagar-andheri-west-mumbai</w:t>
-      </w:r>
-    </w:p>
-    <w:p>
-      <w:pPr>
-        <w:pStyle w:val="ListBullet"/>
-      </w:pPr>
-      <w:r>
-        <w:t>Mayfair Gardens: https://www.squareyards.com/property-rates/mayfair-gardens-azad-nagar-andheri-west-mumbai</w:t>
-      </w:r>
-    </w:p>
-    <w:p>
-      <w:pPr>
-        <w:pStyle w:val="ListBullet"/>
-      </w:pPr>
-      <w:r>
-        <w:t>Kaveri Tower Andheri West: https://www.squareyards.com/property-rates/kaveri-tower-andheri-west-industrial-area-andheri-west-mumbai</w:t>
-      </w:r>
-    </w:p>
-    <w:p>
-      <w:pPr>
-        <w:pStyle w:val="ListBullet"/>
-      </w:pPr>
-      <w:r>
-        <w:t>DLH Metroview: https://www.squareyards.com/property-rates/dlh-metroview-dn-nagar-andheri-west-mumbai</w:t>
-      </w:r>
-    </w:p>
-    <w:p>
-      <w:pPr>
-        <w:pStyle w:val="ListBullet"/>
-      </w:pPr>
-      <w:r>
-        <w:t>Evershine Embassy: https://www.squareyards.com/property-rates/evershine-embassy-shashtri-nagar-andheri-west-mumbai</w:t>
-      </w:r>
-    </w:p>
-    <w:p>
-      <w:pPr>
-        <w:pStyle w:val="ListBullet"/>
-      </w:pPr>
-      <w:r>
-        <w:t>Shree Ashtavinayak CHS Andheri: https://www.squareyards.com/property-rates/shree-ashtavinayak-chs-andheri-dn-nagar-andheri-west-mumbai</w:t>
-      </w:r>
-    </w:p>
-    <w:p>
-      <w:pPr>
-        <w:pStyle w:val="ListBullet"/>
-      </w:pPr>
-      <w:r>
-        <w:t>Mayfair Meridian: https://www.squareyards.com/property-rates/mayfair-meridian-amboli-andheri-west-mumbai</w:t>
-      </w:r>
-    </w:p>
-    <w:p>
-      <w:pPr>
-        <w:pStyle w:val="ListBullet"/>
-      </w:pPr>
-      <w:r>
-        <w:t>K Raheja Raheja Classique: https://www.squareyards.com/property-rates/k-raheja-raheja-classique-shashtri-nagar-andheri-west-mumbai</w:t>
-      </w:r>
-    </w:p>
-    <w:p>
-      <w:pPr>
-        <w:pStyle w:val="ListBullet"/>
-      </w:pPr>
-      <w:r>
-        <w:t>Rustomjee Elita: https://www.squareyards.com/property-rates/rustomjee-elita-four-bunglows-andheri-west-mumbai</w:t>
-      </w:r>
-    </w:p>
-    <w:p>
-      <w:pPr>
-        <w:pStyle w:val="ListBullet"/>
-      </w:pPr>
-      <w:r>
-        <w:t>Oberoi Springs: https://www.squareyards.com/property-rates/oberoi-springs-veera-desai-industrial-estate-andheri-west-mumbai</w:t>
-      </w:r>
-    </w:p>
-    <w:p>
-      <w:pPr>
-        <w:pStyle w:val="ListBullet"/>
-      </w:pPr>
-      <w:r>
-        <w:t>Windermere CHS: https://www.squareyards.com/property-rates/windermere-chs-mhada-colony-andheri-west-mumbai</w:t>
-      </w:r>
-    </w:p>
-    <w:p>
-      <w:pPr>
-        <w:pStyle w:val="ListBullet"/>
-      </w:pPr>
-      <w:r>
-        <w:t>Platinum Life: https://www.squareyards.com/property-rates/platinum-life-dn-nagar-andheri-west-mumbai</w:t>
-      </w:r>
-    </w:p>
-    <w:p>
-      <w:pPr>
-        <w:pStyle w:val="ListBullet"/>
-      </w:pPr>
-      <w:r>
-        <w:t>Evershine Embassy: https://www.squareyards.com/property-rates/evershine-embassy-shashtri-nagar-andheri-west-mumbai</w:t>
-      </w:r>
-    </w:p>
-    <w:p>
-      <w:pPr>
-        <w:pStyle w:val="ListBullet"/>
-      </w:pPr>
-      <w:r>
-        <w:t>Infinite Poorna Apartments: https://www.squareyards.com/property-rates/infinite-poorna-apartments-shashtri-nagar-andheri-west-mumbai</w:t>
-      </w:r>
-    </w:p>
-    <w:p>
-      <w:pPr>
-        <w:pStyle w:val="ListBullet"/>
-      </w:pPr>
-      <w:r>
-        <w:t>Mayfair Meridian: https://www.squareyards.com/property-rates/mayfair-meridian-amboli-andheri-west-mumbai</w:t>
-      </w:r>
-    </w:p>
-    <w:p>
-      <w:pPr>
-        <w:pStyle w:val="ListBullet"/>
-      </w:pPr>
-      <w:r>
-        <w:t>Mayfair Gardens: https://www.squareyards.com/property-rates/mayfair-gardens-azad-nagar-andheri-west-mumbai</w:t>
-      </w:r>
-    </w:p>
-    <w:p>
-      <w:pPr>
-        <w:pStyle w:val="ListBullet"/>
-      </w:pPr>
-      <w:r>
-        <w:t>Ajmera Beverly Hills and Royal Empire: https://www.squareyards.com/property-rates/ajmera-beverly-hills-and-royal-empire-sv-patel-nagar-andheri-west-mumbai</w:t>
+        <w:t>Meta Description: —</w:t>
       </w:r>
     </w:p>
     <w:sectPr>

</xml_diff>